<commit_message>
One page with two tabs, report carries ACS violations, no-Node summary path
</commit_message>
<xml_diff>
--- a/docs/DJ_ACS_Auditor_User_Guide.docx
+++ b/docs/DJ_ACS_Auditor_User_Guide.docx
@@ -175,7 +175,7 @@
           <w:sz w:val="20"/>
           <w:szCs w:val="20"/>
         </w:rPr>
-        <w:t xml:space="preserve">The pages do not connect to anything at all. They have no URL field, no token field, and no network call in them. Data comes out of ACS through the scripts in section 6, which run in a shell where the cluster is reachable and only ever issue a GET.</w:t>
+        <w:t xml:space="preserve">The page does not connect to anything at all. It has no URL field, no token field, and no network call in it. Data comes out of ACS through the scripts in section 7, which run in a shell where the cluster is reachable and only ever issue a GET.</w:t>
       </w:r>
     </w:p>
     <w:p>
@@ -217,7 +217,7 @@
           <w:sz w:val="22"/>
           <w:szCs w:val="22"/>
         </w:rPr>
-        <w:t xml:space="preserve">2. Report, manual, or auto</w:t>
+        <w:t xml:space="preserve">2. One page, two tabs</w:t>
       </w:r>
     </w:p>
     <w:p>
@@ -229,7 +229,7 @@
           <w:sz w:val="22"/>
           <w:szCs w:val="22"/>
         </w:rPr>
-        <w:t xml:space="preserve">3. Before you start</w:t>
+        <w:t xml:space="preserve">3. Report, manual, or auto</w:t>
       </w:r>
     </w:p>
     <w:p>
@@ -241,7 +241,7 @@
           <w:sz w:val="22"/>
           <w:szCs w:val="22"/>
         </w:rPr>
-        <w:t xml:space="preserve">4. Quick start</w:t>
+        <w:t xml:space="preserve">4. Before you start</w:t>
       </w:r>
     </w:p>
     <w:p>
@@ -253,7 +253,7 @@
           <w:sz w:val="22"/>
           <w:szCs w:val="22"/>
         </w:rPr>
-        <w:t xml:space="preserve">5. Loading manifests and reading the audit</w:t>
+        <w:t xml:space="preserve">5. Quick start</w:t>
       </w:r>
     </w:p>
     <w:p>
@@ -265,7 +265,7 @@
           <w:sz w:val="22"/>
           <w:szCs w:val="22"/>
         </w:rPr>
-        <w:t xml:space="preserve">6. Getting the data out of ACS</w:t>
+        <w:t xml:space="preserve">6. Loading manifests and reading the audit</w:t>
       </w:r>
     </w:p>
     <w:p>
@@ -277,7 +277,7 @@
           <w:sz w:val="22"/>
           <w:szCs w:val="22"/>
         </w:rPr>
-        <w:t xml:space="preserve">7. Vulnerabilities: why an empty alert list proves nothing</w:t>
+        <w:t xml:space="preserve">7. Getting the data out of ACS</w:t>
       </w:r>
     </w:p>
     <w:p>
@@ -289,7 +289,7 @@
           <w:sz w:val="22"/>
           <w:szCs w:val="22"/>
         </w:rPr>
-        <w:t xml:space="preserve">8. Working the CVE list</w:t>
+        <w:t xml:space="preserve">8. Vulnerabilities: why an empty alert list proves nothing</w:t>
       </w:r>
     </w:p>
     <w:p>
@@ -301,7 +301,7 @@
           <w:sz w:val="22"/>
           <w:szCs w:val="22"/>
         </w:rPr>
-        <w:t xml:space="preserve">9. Seeing and fixing violations</w:t>
+        <w:t xml:space="preserve">9. Working the CVE list</w:t>
       </w:r>
     </w:p>
     <w:p>
@@ -313,7 +313,7 @@
           <w:sz w:val="22"/>
           <w:szCs w:val="22"/>
         </w:rPr>
-        <w:t xml:space="preserve">10. Applying fixes</w:t>
+        <w:t xml:space="preserve">10. Seeing and fixing violations</w:t>
       </w:r>
     </w:p>
     <w:p>
@@ -325,7 +325,7 @@
           <w:sz w:val="22"/>
           <w:szCs w:val="22"/>
         </w:rPr>
-        <w:t xml:space="preserve">11. What gets fixed automatically, and what deliberately does not</w:t>
+        <w:t xml:space="preserve">11. Applying fixes</w:t>
       </w:r>
     </w:p>
     <w:p>
@@ -337,7 +337,7 @@
           <w:sz w:val="22"/>
           <w:szCs w:val="22"/>
         </w:rPr>
-        <w:t xml:space="preserve">12. Taking the result out</w:t>
+        <w:t xml:space="preserve">12. What gets fixed automatically, and what deliberately does not</w:t>
       </w:r>
     </w:p>
     <w:p>
@@ -349,7 +349,7 @@
           <w:sz w:val="22"/>
           <w:szCs w:val="22"/>
         </w:rPr>
-        <w:t xml:space="preserve">13. How the score is calculated</w:t>
+        <w:t xml:space="preserve">13. Taking the result out</w:t>
       </w:r>
     </w:p>
     <w:p>
@@ -361,7 +361,7 @@
           <w:sz w:val="22"/>
           <w:szCs w:val="22"/>
         </w:rPr>
-        <w:t xml:space="preserve">14. Policy reference</w:t>
+        <w:t xml:space="preserve">14. How the score is calculated</w:t>
       </w:r>
     </w:p>
     <w:p>
@@ -373,7 +373,7 @@
           <w:sz w:val="22"/>
           <w:szCs w:val="22"/>
         </w:rPr>
-        <w:t xml:space="preserve">15. Limits, stated plainly</w:t>
+        <w:t xml:space="preserve">15. Policy reference</w:t>
       </w:r>
     </w:p>
     <w:p>
@@ -385,7 +385,7 @@
           <w:sz w:val="22"/>
           <w:szCs w:val="22"/>
         </w:rPr>
-        <w:t xml:space="preserve">16. Troubleshooting</w:t>
+        <w:t xml:space="preserve">16. Limits, stated plainly</w:t>
       </w:r>
     </w:p>
     <w:p>
@@ -397,7 +397,19 @@
           <w:sz w:val="22"/>
           <w:szCs w:val="22"/>
         </w:rPr>
-        <w:t xml:space="preserve">17. Contact</w:t>
+        <w:t xml:space="preserve">17. Troubleshooting</w:t>
+      </w:r>
+    </w:p>
+    <w:p>
+      <w:pPr>
+        <w:spacing w:after="90"/>
+      </w:pPr>
+      <w:r>
+        <w:rPr>
+          <w:sz w:val="22"/>
+          <w:szCs w:val="22"/>
+        </w:rPr>
+        <w:t xml:space="preserve">18. Contact</w:t>
       </w:r>
     </w:p>
     <w:p>
@@ -424,7 +436,7 @@
           <w:sz w:val="22"/>
           <w:szCs w:val="22"/>
         </w:rPr>
-        <w:t xml:space="preserve">Figure 1. The auditor after a scan (section 5)</w:t>
+        <w:t xml:space="preserve">Figure 1. The Audit tab after a scan (section 6)</w:t>
       </w:r>
     </w:p>
     <w:p>
@@ -437,7 +449,7 @@
           <w:sz w:val="22"/>
           <w:szCs w:val="22"/>
         </w:rPr>
-        <w:t xml:space="preserve">Figure 2. Getting the data out of ACS (section 6)</w:t>
+        <w:t xml:space="preserve">Figure 2. Getting the data out of ACS (section 7)</w:t>
       </w:r>
     </w:p>
     <w:p>
@@ -450,7 +462,7 @@
           <w:sz w:val="22"/>
           <w:szCs w:val="22"/>
         </w:rPr>
-        <w:t xml:space="preserve">Figure 7. The two ACS data planes (section 7)</w:t>
+        <w:t xml:space="preserve">Figure 7. The two ACS data planes (section 8)</w:t>
       </w:r>
     </w:p>
     <w:p>
@@ -463,7 +475,7 @@
           <w:sz w:val="22"/>
           <w:szCs w:val="22"/>
         </w:rPr>
-        <w:t xml:space="preserve">Figure 3. Step through remediation (section 10)</w:t>
+        <w:t xml:space="preserve">Figure 3. Step through remediation (section 11)</w:t>
       </w:r>
     </w:p>
     <w:p>
@@ -476,7 +488,7 @@
           <w:sz w:val="22"/>
           <w:szCs w:val="22"/>
         </w:rPr>
-        <w:t xml:space="preserve">Figure 8. The violations panel and the fix routes (section 9)</w:t>
+        <w:t xml:space="preserve">Figure 8. The violations panel and the fix routes (section 10)</w:t>
       </w:r>
     </w:p>
     <w:p>
@@ -489,7 +501,7 @@
           <w:sz w:val="22"/>
           <w:szCs w:val="22"/>
         </w:rPr>
-        <w:t xml:space="preserve">Figure 4. Export options (section 12)</w:t>
+        <w:t xml:space="preserve">Figure 4. Export options (section 13)</w:t>
       </w:r>
     </w:p>
     <w:p>
@@ -560,8 +572,8 @@
         </w:tblBorders>
       </w:tblPr>
       <w:tblGrid>
-        <w:gridCol w:w="2700"/>
-        <w:gridCol w:w="6600"/>
+        <w:gridCol w:w="2200"/>
+        <w:gridCol w:w="7100"/>
       </w:tblGrid>
       <w:tr>
         <w:trPr>
@@ -569,7 +581,7 @@
         </w:trPr>
         <w:tc>
           <w:tcPr>
-            <w:tcW w:type="dxa" w:w="2700"/>
+            <w:tcW w:type="dxa" w:w="2200"/>
             <w:shd w:fill="EEF3FA" w:val="clear"/>
             <w:tcMar>
               <w:top w:type="dxa" w:w="60"/>
@@ -596,7 +608,7 @@
         </w:tc>
         <w:tc>
           <w:tcPr>
-            <w:tcW w:type="dxa" w:w="6600"/>
+            <w:tcW w:type="dxa" w:w="7100"/>
             <w:shd w:fill="EEF3FA" w:val="clear"/>
             <w:tcMar>
               <w:top w:type="dxa" w:w="60"/>
@@ -625,7 +637,7 @@
       <w:tr>
         <w:tc>
           <w:tcPr>
-            <w:tcW w:type="dxa" w:w="2700"/>
+            <w:tcW w:type="dxa" w:w="2200"/>
             <w:tcMar>
               <w:top w:type="dxa" w:w="60"/>
               <w:left w:type="dxa" w:w="90"/>
@@ -649,25 +661,25 @@
         </w:tc>
         <w:tc>
           <w:tcPr>
-            <w:tcW w:type="dxa" w:w="6600"/>
-            <w:tcMar>
-              <w:top w:type="dxa" w:w="60"/>
-              <w:left w:type="dxa" w:w="90"/>
-              <w:bottom w:type="dxa" w:w="60"/>
-              <w:right w:type="dxa" w:w="90"/>
-            </w:tcMar>
-          </w:tcPr>
-          <w:p>
-            <w:pPr>
-              <w:spacing w:after="0"/>
-            </w:pPr>
-            <w:r>
-              <w:rPr>
-                <w:color w:val="1C2430"/>
-                <w:sz w:val="18"/>
-                <w:szCs w:val="18"/>
-              </w:rPr>
-              <w:t xml:space="preserve">Scan, score, rank, cross check against ACS policy violations and image CVEs, export the report. Read only. It never modifies anything.</w:t>
+            <w:tcW w:type="dxa" w:w="7100"/>
+            <w:tcMar>
+              <w:top w:type="dxa" w:w="60"/>
+              <w:left w:type="dxa" w:w="90"/>
+              <w:bottom w:type="dxa" w:w="60"/>
+              <w:right w:type="dxa" w:w="90"/>
+            </w:tcMar>
+          </w:tcPr>
+          <w:p>
+            <w:pPr>
+              <w:spacing w:after="0"/>
+            </w:pPr>
+            <w:r>
+              <w:rPr>
+                <w:color w:val="1C2430"/>
+                <w:sz w:val="18"/>
+                <w:szCs w:val="18"/>
+              </w:rPr>
+              <w:t xml:space="preserve">The whole browser surface, in two tabs. Audit scans, scores, ranks, cross checks against ACS violations and image CVEs, and exports the report. Remediate applies fixes with preview, confirmation, one at a time stepping, and undo. See section 2.</w:t>
             </w:r>
           </w:p>
         </w:tc>
@@ -675,49 +687,49 @@
       <w:tr>
         <w:tc>
           <w:tcPr>
-            <w:tcW w:type="dxa" w:w="2700"/>
-            <w:tcMar>
-              <w:top w:type="dxa" w:w="60"/>
-              <w:left w:type="dxa" w:w="90"/>
-              <w:bottom w:type="dxa" w:w="60"/>
-              <w:right w:type="dxa" w:w="90"/>
-            </w:tcMar>
-          </w:tcPr>
-          <w:p>
-            <w:pPr>
-              <w:spacing w:after="0"/>
-            </w:pPr>
-            <w:r>
-              <w:rPr>
-                <w:color w:val="1C2430"/>
-                <w:sz w:val="18"/>
-                <w:szCs w:val="18"/>
-              </w:rPr>
-              <w:t xml:space="preserve">dj_acs_remediation.html</w:t>
-            </w:r>
-          </w:p>
-        </w:tc>
-        <w:tc>
-          <w:tcPr>
-            <w:tcW w:type="dxa" w:w="6600"/>
-            <w:tcMar>
-              <w:top w:type="dxa" w:w="60"/>
-              <w:left w:type="dxa" w:w="90"/>
-              <w:bottom w:type="dxa" w:w="60"/>
-              <w:right w:type="dxa" w:w="90"/>
-            </w:tcMar>
-          </w:tcPr>
-          <w:p>
-            <w:pPr>
-              <w:spacing w:after="0"/>
-            </w:pPr>
-            <w:r>
-              <w:rPr>
-                <w:color w:val="1C2430"/>
-                <w:sz w:val="18"/>
-                <w:szCs w:val="18"/>
-              </w:rPr>
-              <w:t xml:space="preserve">Apply fixes interactively with preview, confirmation, one at a time stepping, and undo.</w:t>
+            <w:tcW w:type="dxa" w:w="2200"/>
+            <w:tcMar>
+              <w:top w:type="dxa" w:w="60"/>
+              <w:left w:type="dxa" w:w="90"/>
+              <w:bottom w:type="dxa" w:w="60"/>
+              <w:right w:type="dxa" w:w="90"/>
+            </w:tcMar>
+          </w:tcPr>
+          <w:p>
+            <w:pPr>
+              <w:spacing w:after="0"/>
+            </w:pPr>
+            <w:r>
+              <w:rPr>
+                <w:color w:val="1C2430"/>
+                <w:sz w:val="18"/>
+                <w:szCs w:val="18"/>
+              </w:rPr>
+              <w:t xml:space="preserve">acs_policies.js</w:t>
+            </w:r>
+          </w:p>
+        </w:tc>
+        <w:tc>
+          <w:tcPr>
+            <w:tcW w:type="dxa" w:w="7100"/>
+            <w:tcMar>
+              <w:top w:type="dxa" w:w="60"/>
+              <w:left w:type="dxa" w:w="90"/>
+              <w:bottom w:type="dxa" w:w="60"/>
+              <w:right w:type="dxa" w:w="90"/>
+            </w:tcMar>
+          </w:tcPr>
+          <w:p>
+            <w:pPr>
+              <w:spacing w:after="0"/>
+            </w:pPr>
+            <w:r>
+              <w:rPr>
+                <w:color w:val="1C2430"/>
+                <w:sz w:val="18"/>
+                <w:szCs w:val="18"/>
+              </w:rPr>
+              <w:t xml:space="preserve">The policy engine. Every surface loads this one file, so the page, the command line and the tests cannot disagree about a manifest.</w:t>
             </w:r>
           </w:p>
         </w:tc>
@@ -725,49 +737,49 @@
       <w:tr>
         <w:tc>
           <w:tcPr>
-            <w:tcW w:type="dxa" w:w="2700"/>
-            <w:tcMar>
-              <w:top w:type="dxa" w:w="60"/>
-              <w:left w:type="dxa" w:w="90"/>
-              <w:bottom w:type="dxa" w:w="60"/>
-              <w:right w:type="dxa" w:w="90"/>
-            </w:tcMar>
-          </w:tcPr>
-          <w:p>
-            <w:pPr>
-              <w:spacing w:after="0"/>
-            </w:pPr>
-            <w:r>
-              <w:rPr>
-                <w:color w:val="1C2430"/>
-                <w:sz w:val="18"/>
-                <w:szCs w:val="18"/>
-              </w:rPr>
-              <w:t xml:space="preserve">acs_policies.js</w:t>
-            </w:r>
-          </w:p>
-        </w:tc>
-        <w:tc>
-          <w:tcPr>
-            <w:tcW w:type="dxa" w:w="6600"/>
-            <w:tcMar>
-              <w:top w:type="dxa" w:w="60"/>
-              <w:left w:type="dxa" w:w="90"/>
-              <w:bottom w:type="dxa" w:w="60"/>
-              <w:right w:type="dxa" w:w="90"/>
-            </w:tcMar>
-          </w:tcPr>
-          <w:p>
-            <w:pPr>
-              <w:spacing w:after="0"/>
-            </w:pPr>
-            <w:r>
-              <w:rPr>
-                <w:color w:val="1C2430"/>
-                <w:sz w:val="18"/>
-                <w:szCs w:val="18"/>
-              </w:rPr>
-              <w:t xml:space="preserve">The policy engine both pages share, so the two can never disagree about a manifest.</w:t>
+            <w:tcW w:type="dxa" w:w="2200"/>
+            <w:tcMar>
+              <w:top w:type="dxa" w:w="60"/>
+              <w:left w:type="dxa" w:w="90"/>
+              <w:bottom w:type="dxa" w:w="60"/>
+              <w:right w:type="dxa" w:w="90"/>
+            </w:tcMar>
+          </w:tcPr>
+          <w:p>
+            <w:pPr>
+              <w:spacing w:after="0"/>
+            </w:pPr>
+            <w:r>
+              <w:rPr>
+                <w:color w:val="1C2430"/>
+                <w:sz w:val="18"/>
+                <w:szCs w:val="18"/>
+              </w:rPr>
+              <w:t xml:space="preserve">acs_cli.js</w:t>
+            </w:r>
+          </w:p>
+        </w:tc>
+        <w:tc>
+          <w:tcPr>
+            <w:tcW w:type="dxa" w:w="7100"/>
+            <w:tcMar>
+              <w:top w:type="dxa" w:w="60"/>
+              <w:left w:type="dxa" w:w="90"/>
+              <w:bottom w:type="dxa" w:w="60"/>
+              <w:right w:type="dxa" w:w="90"/>
+            </w:tcMar>
+          </w:tcPr>
+          <w:p>
+            <w:pPr>
+              <w:spacing w:after="0"/>
+            </w:pPr>
+            <w:r>
+              <w:rPr>
+                <w:color w:val="1C2430"/>
+                <w:sz w:val="18"/>
+                <w:szCs w:val="18"/>
+              </w:rPr>
+              <w:t xml:space="preserve">The same engine headless, for a pipeline or a terminal. Needs Node; the page does not.</w:t>
             </w:r>
           </w:p>
         </w:tc>
@@ -775,49 +787,49 @@
       <w:tr>
         <w:tc>
           <w:tcPr>
-            <w:tcW w:type="dxa" w:w="2700"/>
-            <w:tcMar>
-              <w:top w:type="dxa" w:w="60"/>
-              <w:left w:type="dxa" w:w="90"/>
-              <w:bottom w:type="dxa" w:w="60"/>
-              <w:right w:type="dxa" w:w="90"/>
-            </w:tcMar>
-          </w:tcPr>
-          <w:p>
-            <w:pPr>
-              <w:spacing w:after="0"/>
-            </w:pPr>
-            <w:r>
-              <w:rPr>
-                <w:color w:val="1C2430"/>
-                <w:sz w:val="18"/>
-                <w:szCs w:val="18"/>
-              </w:rPr>
-              <w:t xml:space="preserve">vendor/</w:t>
-            </w:r>
-          </w:p>
-        </w:tc>
-        <w:tc>
-          <w:tcPr>
-            <w:tcW w:type="dxa" w:w="6600"/>
-            <w:tcMar>
-              <w:top w:type="dxa" w:w="60"/>
-              <w:left w:type="dxa" w:w="90"/>
-              <w:bottom w:type="dxa" w:w="60"/>
-              <w:right w:type="dxa" w:w="90"/>
-            </w:tcMar>
-          </w:tcPr>
-          <w:p>
-            <w:pPr>
-              <w:spacing w:after="0"/>
-            </w:pPr>
-            <w:r>
-              <w:rPr>
-                <w:color w:val="1C2430"/>
-                <w:sz w:val="18"/>
-                <w:szCs w:val="18"/>
-              </w:rPr>
-              <w:t xml:space="preserve">js-yaml and JSZip, committed to the repository so the tool needs no package manager and no network access.</w:t>
+            <w:tcW w:type="dxa" w:w="2200"/>
+            <w:tcMar>
+              <w:top w:type="dxa" w:w="60"/>
+              <w:left w:type="dxa" w:w="90"/>
+              <w:bottom w:type="dxa" w:w="60"/>
+              <w:right w:type="dxa" w:w="90"/>
+            </w:tcMar>
+          </w:tcPr>
+          <w:p>
+            <w:pPr>
+              <w:spacing w:after="0"/>
+            </w:pPr>
+            <w:r>
+              <w:rPr>
+                <w:color w:val="1C2430"/>
+                <w:sz w:val="18"/>
+                <w:szCs w:val="18"/>
+              </w:rPr>
+              <w:t xml:space="preserve">scripts/</w:t>
+            </w:r>
+          </w:p>
+        </w:tc>
+        <w:tc>
+          <w:tcPr>
+            <w:tcW w:type="dxa" w:w="7100"/>
+            <w:tcMar>
+              <w:top w:type="dxa" w:w="60"/>
+              <w:left w:type="dxa" w:w="90"/>
+              <w:bottom w:type="dxa" w:w="60"/>
+              <w:right w:type="dxa" w:w="90"/>
+            </w:tcMar>
+          </w:tcPr>
+          <w:p>
+            <w:pPr>
+              <w:spacing w:after="0"/>
+            </w:pPr>
+            <w:r>
+              <w:rPr>
+                <w:color w:val="1C2430"/>
+                <w:sz w:val="18"/>
+                <w:szCs w:val="18"/>
+              </w:rPr>
+              <w:t xml:space="preserve">Getting the data out of ACS. Preflight, the full pull, and PowerShell, SSH and oc port forward variants. Bash and curl, no runtime.</w:t>
             </w:r>
           </w:p>
         </w:tc>
@@ -825,7 +837,57 @@
       <w:tr>
         <w:tc>
           <w:tcPr>
-            <w:tcW w:type="dxa" w:w="2700"/>
+            <w:tcW w:type="dxa" w:w="2200"/>
+            <w:tcMar>
+              <w:top w:type="dxa" w:w="60"/>
+              <w:left w:type="dxa" w:w="90"/>
+              <w:bottom w:type="dxa" w:w="60"/>
+              <w:right w:type="dxa" w:w="90"/>
+            </w:tcMar>
+          </w:tcPr>
+          <w:p>
+            <w:pPr>
+              <w:spacing w:after="0"/>
+            </w:pPr>
+            <w:r>
+              <w:rPr>
+                <w:color w:val="1C2430"/>
+                <w:sz w:val="18"/>
+                <w:szCs w:val="18"/>
+              </w:rPr>
+              <w:t xml:space="preserve">vendor/</w:t>
+            </w:r>
+          </w:p>
+        </w:tc>
+        <w:tc>
+          <w:tcPr>
+            <w:tcW w:type="dxa" w:w="7100"/>
+            <w:tcMar>
+              <w:top w:type="dxa" w:w="60"/>
+              <w:left w:type="dxa" w:w="90"/>
+              <w:bottom w:type="dxa" w:w="60"/>
+              <w:right w:type="dxa" w:w="90"/>
+            </w:tcMar>
+          </w:tcPr>
+          <w:p>
+            <w:pPr>
+              <w:spacing w:after="0"/>
+            </w:pPr>
+            <w:r>
+              <w:rPr>
+                <w:color w:val="1C2430"/>
+                <w:sz w:val="18"/>
+                <w:szCs w:val="18"/>
+              </w:rPr>
+              <w:t xml:space="preserve">js-yaml and JSZip, committed to the repository so the tool needs no package manager and no network access.</w:t>
+            </w:r>
+          </w:p>
+        </w:tc>
+      </w:tr>
+      <w:tr>
+        <w:tc>
+          <w:tcPr>
+            <w:tcW w:type="dxa" w:w="2200"/>
             <w:tcMar>
               <w:top w:type="dxa" w:w="60"/>
               <w:left w:type="dxa" w:w="90"/>
@@ -849,25 +911,25 @@
         </w:tc>
         <w:tc>
           <w:tcPr>
-            <w:tcW w:type="dxa" w:w="6600"/>
-            <w:tcMar>
-              <w:top w:type="dxa" w:w="60"/>
-              <w:left w:type="dxa" w:w="90"/>
-              <w:bottom w:type="dxa" w:w="60"/>
-              <w:right w:type="dxa" w:w="90"/>
-            </w:tcMar>
-          </w:tcPr>
-          <w:p>
-            <w:pPr>
-              <w:spacing w:after="0"/>
-            </w:pPr>
-            <w:r>
-              <w:rPr>
-                <w:color w:val="1C2430"/>
-                <w:sz w:val="18"/>
-                <w:szCs w:val="18"/>
-              </w:rPr>
-              <w:t xml:space="preserve">531 tests against the real engine, the pages and the command line.</w:t>
+            <w:tcW w:type="dxa" w:w="7100"/>
+            <w:tcMar>
+              <w:top w:type="dxa" w:w="60"/>
+              <w:left w:type="dxa" w:w="90"/>
+              <w:bottom w:type="dxa" w:w="60"/>
+              <w:right w:type="dxa" w:w="90"/>
+            </w:tcMar>
+          </w:tcPr>
+          <w:p>
+            <w:pPr>
+              <w:spacing w:after="0"/>
+            </w:pPr>
+            <w:r>
+              <w:rPr>
+                <w:color w:val="1C2430"/>
+                <w:sz w:val="18"/>
+                <w:szCs w:val="18"/>
+              </w:rPr>
+              <w:t xml:space="preserve">823 tests against the real engine, the page, the scripts and the command line.</w:t>
             </w:r>
           </w:p>
         </w:tc>
@@ -894,7 +956,7 @@
           <w:sz w:val="21"/>
           <w:szCs w:val="21"/>
         </w:rPr>
-        <w:t xml:space="preserve">Open either HTML file by double clicking it. There is nothing to install, no server to start, and no package manager involved.</w:t>
+        <w:t xml:space="preserve">Open dj_acs_auditor.html by double clicking it. There is nothing to install, no server to start, and no package manager involved. Node is needed only for the command line runner and the test suite, never for the page.</w:t>
       </w:r>
     </w:p>
     <w:p>
@@ -907,7 +969,432 @@
           <w:sz w:val="21"/>
           <w:szCs w:val="21"/>
         </w:rPr>
-        <w:t xml:space="preserve">2. Report, manual, or auto</w:t>
+        <w:t xml:space="preserve">2. One page, two tabs</w:t>
+      </w:r>
+    </w:p>
+    <w:p>
+      <w:pPr>
+        <w:spacing w:after="120"/>
+      </w:pPr>
+      <w:r>
+        <w:rPr>
+          <w:sz w:val="21"/>
+          <w:szCs w:val="21"/>
+        </w:rPr>
+        <w:t xml:space="preserve">There is one file to open, dj_acs_auditor.html, and it has two tabs.</w:t>
+      </w:r>
+    </w:p>
+    <w:tbl>
+      <w:tblPr>
+        <w:tblW w:type="dxa" w:w="9300"/>
+        <w:tblBorders>
+          <w:top w:val="single" w:color="D0D7DE" w:sz="2"/>
+          <w:left w:val="single" w:color="D0D7DE" w:sz="2"/>
+          <w:bottom w:val="single" w:color="D0D7DE" w:sz="2"/>
+          <w:right w:val="single" w:color="D0D7DE" w:sz="2"/>
+          <w:insideH w:val="single" w:color="D0D7DE" w:sz="2"/>
+          <w:insideV w:val="single" w:color="D0D7DE" w:sz="2"/>
+        </w:tblBorders>
+      </w:tblPr>
+      <w:tblGrid>
+        <w:gridCol w:w="1500"/>
+        <w:gridCol w:w="5000"/>
+        <w:gridCol w:w="2800"/>
+      </w:tblGrid>
+      <w:tr>
+        <w:trPr>
+          <w:tblHeader/>
+        </w:trPr>
+        <w:tc>
+          <w:tcPr>
+            <w:tcW w:type="dxa" w:w="1500"/>
+            <w:shd w:fill="EEF3FA" w:val="clear"/>
+            <w:tcMar>
+              <w:top w:type="dxa" w:w="60"/>
+              <w:left w:type="dxa" w:w="90"/>
+              <w:bottom w:type="dxa" w:w="60"/>
+              <w:right w:type="dxa" w:w="90"/>
+            </w:tcMar>
+          </w:tcPr>
+          <w:p>
+            <w:pPr>
+              <w:spacing w:after="0"/>
+            </w:pPr>
+            <w:r>
+              <w:rPr>
+                <w:b/>
+                <w:bCs/>
+                <w:color w:val="1C2430"/>
+                <w:sz w:val="18"/>
+                <w:szCs w:val="18"/>
+              </w:rPr>
+              <w:t xml:space="preserve">Tab</w:t>
+            </w:r>
+          </w:p>
+        </w:tc>
+        <w:tc>
+          <w:tcPr>
+            <w:tcW w:type="dxa" w:w="5000"/>
+            <w:shd w:fill="EEF3FA" w:val="clear"/>
+            <w:tcMar>
+              <w:top w:type="dxa" w:w="60"/>
+              <w:left w:type="dxa" w:w="90"/>
+              <w:bottom w:type="dxa" w:w="60"/>
+              <w:right w:type="dxa" w:w="90"/>
+            </w:tcMar>
+          </w:tcPr>
+          <w:p>
+            <w:pPr>
+              <w:spacing w:after="0"/>
+            </w:pPr>
+            <w:r>
+              <w:rPr>
+                <w:b/>
+                <w:bCs/>
+                <w:color w:val="1C2430"/>
+                <w:sz w:val="18"/>
+                <w:szCs w:val="18"/>
+              </w:rPr>
+              <w:t xml:space="preserve">What it is for</w:t>
+            </w:r>
+          </w:p>
+        </w:tc>
+        <w:tc>
+          <w:tcPr>
+            <w:tcW w:type="dxa" w:w="2800"/>
+            <w:shd w:fill="EEF3FA" w:val="clear"/>
+            <w:tcMar>
+              <w:top w:type="dxa" w:w="60"/>
+              <w:left w:type="dxa" w:w="90"/>
+              <w:bottom w:type="dxa" w:w="60"/>
+              <w:right w:type="dxa" w:w="90"/>
+            </w:tcMar>
+          </w:tcPr>
+          <w:p>
+            <w:pPr>
+              <w:spacing w:after="0"/>
+            </w:pPr>
+            <w:r>
+              <w:rPr>
+                <w:b/>
+                <w:bCs/>
+                <w:color w:val="1C2430"/>
+                <w:sz w:val="18"/>
+                <w:szCs w:val="18"/>
+              </w:rPr>
+              <w:t xml:space="preserve">What it can change</w:t>
+            </w:r>
+          </w:p>
+        </w:tc>
+      </w:tr>
+      <w:tr>
+        <w:tc>
+          <w:tcPr>
+            <w:tcW w:type="dxa" w:w="1500"/>
+            <w:tcMar>
+              <w:top w:type="dxa" w:w="60"/>
+              <w:left w:type="dxa" w:w="90"/>
+              <w:bottom w:type="dxa" w:w="60"/>
+              <w:right w:type="dxa" w:w="90"/>
+            </w:tcMar>
+          </w:tcPr>
+          <w:p>
+            <w:pPr>
+              <w:spacing w:after="0"/>
+            </w:pPr>
+            <w:r>
+              <w:rPr>
+                <w:color w:val="1C2430"/>
+                <w:sz w:val="18"/>
+                <w:szCs w:val="18"/>
+              </w:rPr>
+              <w:t xml:space="preserve">Audit</w:t>
+            </w:r>
+          </w:p>
+        </w:tc>
+        <w:tc>
+          <w:tcPr>
+            <w:tcW w:type="dxa" w:w="5000"/>
+            <w:tcMar>
+              <w:top w:type="dxa" w:w="60"/>
+              <w:left w:type="dxa" w:w="90"/>
+              <w:bottom w:type="dxa" w:w="60"/>
+              <w:right w:type="dxa" w:w="90"/>
+            </w:tcMar>
+          </w:tcPr>
+          <w:p>
+            <w:pPr>
+              <w:spacing w:after="0"/>
+            </w:pPr>
+            <w:r>
+              <w:rPr>
+                <w:color w:val="1C2430"/>
+                <w:sz w:val="18"/>
+                <w:szCs w:val="18"/>
+              </w:rPr>
+              <w:t xml:space="preserve">Reading. Posture, the findings table, the cross check against ACS, the violations panel, image CVEs, the policy catalogue, and the reports you take away. Drafting a patch from an ACS violation happens here too.</w:t>
+            </w:r>
+          </w:p>
+        </w:tc>
+        <w:tc>
+          <w:tcPr>
+            <w:tcW w:type="dxa" w:w="2800"/>
+            <w:tcMar>
+              <w:top w:type="dxa" w:w="60"/>
+              <w:left w:type="dxa" w:w="90"/>
+              <w:bottom w:type="dxa" w:w="60"/>
+              <w:right w:type="dxa" w:w="90"/>
+            </w:tcMar>
+          </w:tcPr>
+          <w:p>
+            <w:pPr>
+              <w:spacing w:after="0"/>
+            </w:pPr>
+            <w:r>
+              <w:rPr>
+                <w:color w:val="1C2430"/>
+                <w:sz w:val="18"/>
+                <w:szCs w:val="18"/>
+              </w:rPr>
+              <w:t xml:space="preserve">Nothing you loaded. Drafting a patch writes a new file for you to review; it does not touch your manifests.</w:t>
+            </w:r>
+          </w:p>
+        </w:tc>
+      </w:tr>
+      <w:tr>
+        <w:tc>
+          <w:tcPr>
+            <w:tcW w:type="dxa" w:w="1500"/>
+            <w:tcMar>
+              <w:top w:type="dxa" w:w="60"/>
+              <w:left w:type="dxa" w:w="90"/>
+              <w:bottom w:type="dxa" w:w="60"/>
+              <w:right w:type="dxa" w:w="90"/>
+            </w:tcMar>
+          </w:tcPr>
+          <w:p>
+            <w:pPr>
+              <w:spacing w:after="0"/>
+            </w:pPr>
+            <w:r>
+              <w:rPr>
+                <w:color w:val="1C2430"/>
+                <w:sz w:val="18"/>
+                <w:szCs w:val="18"/>
+              </w:rPr>
+              <w:t xml:space="preserve">Remediate</w:t>
+            </w:r>
+          </w:p>
+        </w:tc>
+        <w:tc>
+          <w:tcPr>
+            <w:tcW w:type="dxa" w:w="5000"/>
+            <w:tcMar>
+              <w:top w:type="dxa" w:w="60"/>
+              <w:left w:type="dxa" w:w="90"/>
+              <w:bottom w:type="dxa" w:w="60"/>
+              <w:right w:type="dxa" w:w="90"/>
+            </w:tcMar>
+          </w:tcPr>
+          <w:p>
+            <w:pPr>
+              <w:spacing w:after="0"/>
+            </w:pPr>
+            <w:r>
+              <w:rPr>
+                <w:color w:val="1C2430"/>
+                <w:sz w:val="18"/>
+                <w:szCs w:val="18"/>
+              </w:rPr>
+              <w:t xml:space="preserve">Changing. Step through fixes one at a time, review and apply a batch, replace an image reference, undo any of it.</w:t>
+            </w:r>
+          </w:p>
+        </w:tc>
+        <w:tc>
+          <w:tcPr>
+            <w:tcW w:type="dxa" w:w="2800"/>
+            <w:tcMar>
+              <w:top w:type="dxa" w:w="60"/>
+              <w:left w:type="dxa" w:w="90"/>
+              <w:bottom w:type="dxa" w:w="60"/>
+              <w:right w:type="dxa" w:w="90"/>
+            </w:tcMar>
+          </w:tcPr>
+          <w:p>
+            <w:pPr>
+              <w:spacing w:after="0"/>
+            </w:pPr>
+            <w:r>
+              <w:rPr>
+                <w:color w:val="1C2430"/>
+                <w:sz w:val="18"/>
+                <w:szCs w:val="18"/>
+              </w:rPr>
+              <w:t xml:space="preserve">The YAML you loaded, in memory, and only once you move the Mode selector off Report only. Files on disk change when you download the result.</w:t>
+            </w:r>
+          </w:p>
+        </w:tc>
+      </w:tr>
+    </w:tbl>
+    <w:p>
+      <w:pPr>
+        <w:spacing w:after="140"/>
+      </w:pPr>
+      <w:r>
+        <w:rPr>
+          <w:sz w:val="21"/>
+          <w:szCs w:val="21"/>
+        </w:rPr>
+        <w:t xml:space="preserve"/>
+      </w:r>
+    </w:p>
+    <w:p>
+      <w:pPr>
+        <w:spacing w:after="120"/>
+      </w:pPr>
+      <w:r>
+        <w:rPr>
+          <w:sz w:val="21"/>
+          <w:szCs w:val="21"/>
+        </w:rPr>
+        <w:t xml:space="preserve">They share one loaded file set, one scan and one mode gate. Load your manifests and your ACS export once and both tabs see them.</w:t>
+      </w:r>
+    </w:p>
+    <w:p>
+      <w:pPr>
+        <w:pBdr>
+          <w:top w:val="single" w:color="EEF3FA" w:sz="2"/>
+          <w:bottom w:val="single" w:color="EEF3FA" w:sz="2"/>
+          <w:left w:val="single" w:color="1F6FEB" w:sz="18"/>
+        </w:pBdr>
+        <w:shd w:fill="EEF3FA" w:val="clear"/>
+        <w:spacing w:after="0" w:before="120"/>
+        <w:ind w:left="160" w:right="160"/>
+      </w:pPr>
+      <w:r>
+        <w:rPr>
+          <w:b/>
+          <w:bCs/>
+          <w:color w:val="1C2430"/>
+          <w:sz w:val="20"/>
+          <w:szCs w:val="20"/>
+        </w:rPr>
+        <w:t xml:space="preserve">Why the Mode selector sits above the tabs rather than inside one</w:t>
+      </w:r>
+    </w:p>
+    <w:p>
+      <w:pPr>
+        <w:pBdr>
+          <w:top w:val="single" w:color="EEF3FA" w:sz="2"/>
+          <w:bottom w:val="single" w:color="EEF3FA" w:sz="2"/>
+          <w:left w:val="single" w:color="1F6FEB" w:sz="18"/>
+        </w:pBdr>
+        <w:shd w:fill="EEF3FA" w:val="clear"/>
+        <w:spacing w:after="40"/>
+        <w:ind w:left="160" w:right="160"/>
+      </w:pPr>
+      <w:r>
+        <w:rPr>
+          <w:color w:val="1C2430"/>
+          <w:sz w:val="20"/>
+          <w:szCs w:val="20"/>
+        </w:rPr>
+        <w:t xml:space="preserve">It governs both. A control that decides whether the tool may write has to be visible from wherever you are standing when you ask it to write.</w:t>
+      </w:r>
+    </w:p>
+    <w:p>
+      <w:pPr>
+        <w:pBdr>
+          <w:top w:val="single" w:color="EEF3FA" w:sz="2"/>
+          <w:bottom w:val="single" w:color="EEF3FA" w:sz="2"/>
+          <w:left w:val="single" w:color="1F6FEB" w:sz="18"/>
+        </w:pBdr>
+        <w:shd w:fill="EEF3FA" w:val="clear"/>
+        <w:spacing w:after="160"/>
+        <w:ind w:left="160" w:right="160"/>
+      </w:pPr>
+      <w:r>
+        <w:rPr>
+          <w:color w:val="1C2430"/>
+          <w:sz w:val="20"/>
+          <w:szCs w:val="20"/>
+        </w:rPr>
+        <w:t xml:space="preserve">Put it inside the Remediate tab and the Audit tab would be drafting patches under a setting you cannot currently see. That is the kind of arrangement where somebody is genuinely surprised by what came out, and being surprised by a security tool is the failure this whole design is built to avoid.</w:t>
+      </w:r>
+    </w:p>
+    <w:p>
+      <w:pPr>
+        <w:pBdr>
+          <w:top w:val="single" w:color="FFF8E1" w:sz="2"/>
+          <w:bottom w:val="single" w:color="FFF8E1" w:sz="2"/>
+          <w:left w:val="single" w:color="D4A72C" w:sz="18"/>
+        </w:pBdr>
+        <w:shd w:fill="FFF8E1" w:val="clear"/>
+        <w:spacing w:after="0" w:before="120"/>
+        <w:ind w:left="160" w:right="160"/>
+      </w:pPr>
+      <w:r>
+        <w:rPr>
+          <w:b/>
+          <w:bCs/>
+          <w:color w:val="1C2430"/>
+          <w:sz w:val="20"/>
+          <w:szCs w:val="20"/>
+        </w:rPr>
+        <w:t xml:space="preserve">If you are coming from an earlier version</w:t>
+      </w:r>
+    </w:p>
+    <w:p>
+      <w:pPr>
+        <w:pBdr>
+          <w:top w:val="single" w:color="FFF8E1" w:sz="2"/>
+          <w:bottom w:val="single" w:color="FFF8E1" w:sz="2"/>
+          <w:left w:val="single" w:color="D4A72C" w:sz="18"/>
+        </w:pBdr>
+        <w:shd w:fill="FFF8E1" w:val="clear"/>
+        <w:spacing w:after="40"/>
+        <w:ind w:left="160" w:right="160"/>
+      </w:pPr>
+      <w:r>
+        <w:rPr>
+          <w:color w:val="1C2430"/>
+          <w:sz w:val="20"/>
+          <w:szCs w:val="20"/>
+        </w:rPr>
+        <w:t xml:space="preserve">There used to be two files: dj_acs_auditor.html and dj_acs_remediation.html. They are now one, and the remediation file is deleted.</w:t>
+      </w:r>
+    </w:p>
+    <w:p>
+      <w:pPr>
+        <w:pBdr>
+          <w:top w:val="single" w:color="FFF8E1" w:sz="2"/>
+          <w:bottom w:val="single" w:color="FFF8E1" w:sz="2"/>
+          <w:left w:val="single" w:color="D4A72C" w:sz="18"/>
+        </w:pBdr>
+        <w:shd w:fill="FFF8E1" w:val="clear"/>
+        <w:spacing w:after="160"/>
+        <w:ind w:left="160" w:right="160"/>
+      </w:pPr>
+      <w:r>
+        <w:rPr>
+          <w:color w:val="1C2430"/>
+          <w:sz w:val="20"/>
+          <w:szCs w:val="20"/>
+        </w:rPr>
+        <w:t xml:space="preserve">This was not tidying. Eighteen functions existed in both files, ten of them byte identical, and they were kept in step by hand. That is how a fix reached one surface and not the other, which happened more than once. One file means one file list, one violations table and one mode gate, and no way for the two halves to drift apart.</w:t>
+      </w:r>
+    </w:p>
+    <w:p>
+      <w:pPr>
+        <w:pStyle w:val="Heading1"/>
+        <w:spacing w:after="140" w:before="320"/>
+      </w:pPr>
+      <w:r>
+        <w:rPr>
+          <w:sz w:val="21"/>
+          <w:szCs w:val="21"/>
+        </w:rPr>
+        <w:t xml:space="preserve">3. Report, manual, or auto</w:t>
       </w:r>
     </w:p>
     <w:p>
@@ -949,7 +1436,7 @@
           <w:sz w:val="20"/>
           <w:szCs w:val="20"/>
         </w:rPr>
-        <w:t xml:space="preserve">Report is the default on every surface, in the pages and in the command line. The safe state is the one you get by doing nothing, not the one you get by remembering a flag.</w:t>
+        <w:t xml:space="preserve">Report is the default on every surface, on the page and on the command line. The safe state is the one you get by doing nothing, not the one you get by remembering a flag.</w:t>
       </w:r>
     </w:p>
     <w:p>
@@ -1344,7 +1831,7 @@
           <w:sz w:val="21"/>
           <w:szCs w:val="21"/>
         </w:rPr>
-        <w:t xml:space="preserve">Three rules follow from that, and they are enforced identically in the pages, the command line, and every file either of them writes.</w:t>
+        <w:t xml:space="preserve">Three rules follow from that, and they are enforced identically on the page, on the command line, and in every file either of them writes.</w:t>
       </w:r>
     </w:p>
     <w:p>
@@ -1408,7 +1895,7 @@
           <w:sz w:val="21"/>
           <w:szCs w:val="21"/>
         </w:rPr>
-        <w:t xml:space="preserve">On the pages</w:t>
+        <w:t xml:space="preserve">On the page</w:t>
       </w:r>
     </w:p>
     <w:p>
@@ -1420,7 +1907,7 @@
           <w:sz w:val="21"/>
           <w:szCs w:val="21"/>
         </w:rPr>
-        <w:t xml:space="preserve">The remediation page opens in report mode and nothing on it will change a file until you move off it. The mode gates the buttons and the handlers, not just the buttons: calling the apply functions directly from the browser console in report mode still refuses, because a disabled attribute is a hint about state, not a control over it.</w:t>
+        <w:t xml:space="preserve">The page opens in report mode and nothing will change a file until you move off it. One mode selector sits above the tabs and governs both of them, because a control that decides whether the tool may write has to be visible from wherever you are standing when you ask it to write. The mode gates the handlers, not just the buttons: calling the apply functions directly from the browser console in report mode still refuses, because a disabled attribute is a hint about state rather than a control over it.</w:t>
       </w:r>
     </w:p>
     <w:p>
@@ -1835,7 +2322,7 @@
           <w:sz w:val="21"/>
           <w:szCs w:val="21"/>
         </w:rPr>
-        <w:t xml:space="preserve">3. Before you start</w:t>
+        <w:t xml:space="preserve">4. Before you start</w:t>
       </w:r>
     </w:p>
     <w:p>
@@ -1848,71 +2335,7 @@
           <w:sz w:val="21"/>
           <w:szCs w:val="21"/>
         </w:rPr>
-        <w:t xml:space="preserve">Requirements</w:t>
-      </w:r>
-    </w:p>
-    <w:p>
-      <w:pPr>
-        <w:pStyle w:val="ListParagraph"/>
-        <w:numPr>
-          <w:ilvl w:val="0"/>
-          <w:numId w:val="2"/>
-        </w:numPr>
-        <w:spacing w:after="70"/>
-      </w:pPr>
-      <w:r>
-        <w:rPr>
-          <w:sz w:val="21"/>
-          <w:szCs w:val="21"/>
-        </w:rPr>
-        <w:t xml:space="preserve">A current browser. Chrome, Edge, Firefox, or Safari. The pages use the File System Access API for folder upload where available and fall back to a directory input where it is not.</w:t>
-      </w:r>
-    </w:p>
-    <w:p>
-      <w:pPr>
-        <w:pStyle w:val="ListParagraph"/>
-        <w:numPr>
-          <w:ilvl w:val="0"/>
-          <w:numId w:val="2"/>
-        </w:numPr>
-        <w:spacing w:after="70"/>
-      </w:pPr>
-      <w:r>
-        <w:rPr>
-          <w:sz w:val="21"/>
-          <w:szCs w:val="21"/>
-        </w:rPr>
-        <w:t xml:space="preserve">The YAML you want audited, either as loose files or a whole folder tree.</w:t>
-      </w:r>
-    </w:p>
-    <w:p>
-      <w:pPr>
-        <w:pStyle w:val="ListParagraph"/>
-        <w:numPr>
-          <w:ilvl w:val="0"/>
-          <w:numId w:val="2"/>
-        </w:numPr>
-        <w:spacing w:after="70"/>
-      </w:pPr>
-      <w:r>
-        <w:rPr>
-          <w:sz w:val="21"/>
-          <w:szCs w:val="21"/>
-        </w:rPr>
-        <w:t xml:space="preserve">Optional: a violation export from ACS Central, or a live token if you plan to pull from the cluster directly.</w:t>
-      </w:r>
-    </w:p>
-    <w:p>
-      <w:pPr>
-        <w:pStyle w:val="Heading2"/>
-        <w:spacing w:after="100" w:before="240"/>
-      </w:pPr>
-      <w:r>
-        <w:rPr>
-          <w:sz w:val="21"/>
-          <w:szCs w:val="21"/>
-        </w:rPr>
-        <w:t xml:space="preserve">What the tool never asks for</w:t>
+        <w:t xml:space="preserve">What you actually need installed</w:t>
       </w:r>
     </w:p>
     <w:p>
@@ -1924,130 +2347,641 @@
           <w:sz w:val="21"/>
           <w:szCs w:val="21"/>
         </w:rPr>
-        <w:t xml:space="preserve">It does not ask for cluster write access, a kubeconfig, a service account, an admission webhook, or anything installed on a node. If a workflow ever seems to want one of those, you are not in this tool.</w:t>
-      </w:r>
-    </w:p>
-    <w:p>
-      <w:pPr>
-        <w:pStyle w:val="Heading2"/>
-        <w:spacing w:after="100" w:before="240"/>
-      </w:pPr>
-      <w:r>
-        <w:rPr>
-          <w:sz w:val="21"/>
-          <w:szCs w:val="21"/>
-        </w:rPr>
-        <w:t xml:space="preserve">Working disconnected</w:t>
-      </w:r>
-    </w:p>
-    <w:p>
-      <w:pPr>
-        <w:spacing w:after="120"/>
-      </w:pPr>
-      <w:r>
-        <w:rPr>
-          <w:sz w:val="21"/>
-          <w:szCs w:val="21"/>
-        </w:rPr>
-        <w:t xml:space="preserve">Everything the pages need is committed alongside them. js-yaml and JSZip are vendored, so a machine with no route to the internet, no npm, and no proxy runs the tool identically to one that is fully connected. This matters on classified and air gapped networks, where the usual answer of "just npm install it" is not available.</w:t>
-      </w:r>
-    </w:p>
-    <w:p>
-      <w:pPr>
-        <w:pStyle w:val="Heading1"/>
-        <w:spacing w:after="140" w:before="320"/>
-      </w:pPr>
-      <w:r>
-        <w:rPr>
-          <w:sz w:val="21"/>
-          <w:szCs w:val="21"/>
-        </w:rPr>
-        <w:t xml:space="preserve">4. Quick start</w:t>
-      </w:r>
-    </w:p>
-    <w:p>
-      <w:pPr>
-        <w:pStyle w:val="ListParagraph"/>
-        <w:numPr>
-          <w:ilvl w:val="0"/>
-          <w:numId w:val="3"/>
-        </w:numPr>
-        <w:spacing w:after="70"/>
-      </w:pPr>
-      <w:r>
-        <w:rPr>
-          <w:sz w:val="21"/>
-          <w:szCs w:val="21"/>
-        </w:rPr>
-        <w:t xml:space="preserve">Open dj_acs_auditor.html.</w:t>
-      </w:r>
-    </w:p>
-    <w:p>
-      <w:pPr>
-        <w:pStyle w:val="ListParagraph"/>
-        <w:numPr>
-          <w:ilvl w:val="0"/>
-          <w:numId w:val="3"/>
-        </w:numPr>
-        <w:spacing w:after="70"/>
-      </w:pPr>
-      <w:r>
-        <w:rPr>
-          <w:sz w:val="21"/>
-          <w:szCs w:val="21"/>
-        </w:rPr>
-        <w:t xml:space="preserve">Drag your manifest folder onto the drop zone, or press Browse folder.</w:t>
-      </w:r>
-    </w:p>
-    <w:p>
-      <w:pPr>
-        <w:pStyle w:val="ListParagraph"/>
-        <w:numPr>
-          <w:ilvl w:val="0"/>
-          <w:numId w:val="3"/>
-        </w:numPr>
-        <w:spacing w:after="70"/>
-      </w:pPr>
-      <w:r>
-        <w:rPr>
-          <w:sz w:val="21"/>
-          <w:szCs w:val="21"/>
-        </w:rPr>
-        <w:t xml:space="preserve">Read the posture cards at the top. They tell you the weighted compliance score now and what it becomes once the safe fixes are applied.</w:t>
-      </w:r>
-    </w:p>
-    <w:p>
-      <w:pPr>
-        <w:pStyle w:val="ListParagraph"/>
-        <w:numPr>
-          <w:ilvl w:val="0"/>
-          <w:numId w:val="3"/>
-        </w:numPr>
-        <w:spacing w:after="70"/>
-      </w:pPr>
-      <w:r>
-        <w:rPr>
-          <w:sz w:val="21"/>
-          <w:szCs w:val="21"/>
-        </w:rPr>
-        <w:t xml:space="preserve">Sort the findings table by Score to see what hurts most.</w:t>
-      </w:r>
-    </w:p>
-    <w:p>
-      <w:pPr>
-        <w:pStyle w:val="ListParagraph"/>
-        <w:numPr>
-          <w:ilvl w:val="0"/>
-          <w:numId w:val="3"/>
-        </w:numPr>
-        <w:spacing w:after="70"/>
-      </w:pPr>
-      <w:r>
-        <w:rPr>
-          <w:sz w:val="21"/>
-          <w:szCs w:val="21"/>
-        </w:rPr>
-        <w:t xml:space="preserve">Press Download the audit report to keep the evidence, then move to dj_acs_remediation.html to actually fix it.</w:t>
+        <w:t xml:space="preserve">The answer for most people is nothing. The page is a file you open.</w:t>
+      </w:r>
+    </w:p>
+    <w:tbl>
+      <w:tblPr>
+        <w:tblW w:type="dxa" w:w="9300"/>
+        <w:tblBorders>
+          <w:top w:val="single" w:color="D0D7DE" w:sz="2"/>
+          <w:left w:val="single" w:color="D0D7DE" w:sz="2"/>
+          <w:bottom w:val="single" w:color="D0D7DE" w:sz="2"/>
+          <w:right w:val="single" w:color="D0D7DE" w:sz="2"/>
+          <w:insideH w:val="single" w:color="D0D7DE" w:sz="2"/>
+          <w:insideV w:val="single" w:color="D0D7DE" w:sz="2"/>
+        </w:tblBorders>
+      </w:tblPr>
+      <w:tblGrid>
+        <w:gridCol w:w="4100"/>
+        <w:gridCol w:w="3400"/>
+        <w:gridCol w:w="1800"/>
+      </w:tblGrid>
+      <w:tr>
+        <w:trPr>
+          <w:tblHeader/>
+        </w:trPr>
+        <w:tc>
+          <w:tcPr>
+            <w:tcW w:type="dxa" w:w="4100"/>
+            <w:shd w:fill="EEF3FA" w:val="clear"/>
+            <w:tcMar>
+              <w:top w:type="dxa" w:w="60"/>
+              <w:left w:type="dxa" w:w="90"/>
+              <w:bottom w:type="dxa" w:w="60"/>
+              <w:right w:type="dxa" w:w="90"/>
+            </w:tcMar>
+          </w:tcPr>
+          <w:p>
+            <w:pPr>
+              <w:spacing w:after="0"/>
+            </w:pPr>
+            <w:r>
+              <w:rPr>
+                <w:b/>
+                <w:bCs/>
+                <w:color w:val="1C2430"/>
+                <w:sz w:val="18"/>
+                <w:szCs w:val="18"/>
+              </w:rPr>
+              <w:t xml:space="preserve">To do this</w:t>
+            </w:r>
+          </w:p>
+        </w:tc>
+        <w:tc>
+          <w:tcPr>
+            <w:tcW w:type="dxa" w:w="3400"/>
+            <w:shd w:fill="EEF3FA" w:val="clear"/>
+            <w:tcMar>
+              <w:top w:type="dxa" w:w="60"/>
+              <w:left w:type="dxa" w:w="90"/>
+              <w:bottom w:type="dxa" w:w="60"/>
+              <w:right w:type="dxa" w:w="90"/>
+            </w:tcMar>
+          </w:tcPr>
+          <w:p>
+            <w:pPr>
+              <w:spacing w:after="0"/>
+            </w:pPr>
+            <w:r>
+              <w:rPr>
+                <w:b/>
+                <w:bCs/>
+                <w:color w:val="1C2430"/>
+                <w:sz w:val="18"/>
+                <w:szCs w:val="18"/>
+              </w:rPr>
+              <w:t xml:space="preserve">You need</w:t>
+            </w:r>
+          </w:p>
+        </w:tc>
+        <w:tc>
+          <w:tcPr>
+            <w:tcW w:type="dxa" w:w="1800"/>
+            <w:shd w:fill="EEF3FA" w:val="clear"/>
+            <w:tcMar>
+              <w:top w:type="dxa" w:w="60"/>
+              <w:left w:type="dxa" w:w="90"/>
+              <w:bottom w:type="dxa" w:w="60"/>
+              <w:right w:type="dxa" w:w="90"/>
+            </w:tcMar>
+          </w:tcPr>
+          <w:p>
+            <w:pPr>
+              <w:spacing w:after="0"/>
+            </w:pPr>
+            <w:r>
+              <w:rPr>
+                <w:b/>
+                <w:bCs/>
+                <w:color w:val="1C2430"/>
+                <w:sz w:val="18"/>
+                <w:szCs w:val="18"/>
+              </w:rPr>
+              <w:t xml:space="preserve">Node?</w:t>
+            </w:r>
+          </w:p>
+        </w:tc>
+      </w:tr>
+      <w:tr>
+        <w:tc>
+          <w:tcPr>
+            <w:tcW w:type="dxa" w:w="4100"/>
+            <w:tcMar>
+              <w:top w:type="dxa" w:w="60"/>
+              <w:left w:type="dxa" w:w="90"/>
+              <w:bottom w:type="dxa" w:w="60"/>
+              <w:right w:type="dxa" w:w="90"/>
+            </w:tcMar>
+          </w:tcPr>
+          <w:p>
+            <w:pPr>
+              <w:spacing w:after="0"/>
+            </w:pPr>
+            <w:r>
+              <w:rPr>
+                <w:color w:val="1C2430"/>
+                <w:sz w:val="18"/>
+                <w:szCs w:val="18"/>
+              </w:rPr>
+              <w:t xml:space="preserve">Read, score, cross check, see violations, draft fixes, export the report</w:t>
+            </w:r>
+          </w:p>
+        </w:tc>
+        <w:tc>
+          <w:tcPr>
+            <w:tcW w:type="dxa" w:w="3400"/>
+            <w:tcMar>
+              <w:top w:type="dxa" w:w="60"/>
+              <w:left w:type="dxa" w:w="90"/>
+              <w:bottom w:type="dxa" w:w="60"/>
+              <w:right w:type="dxa" w:w="90"/>
+            </w:tcMar>
+          </w:tcPr>
+          <w:p>
+            <w:pPr>
+              <w:spacing w:after="0"/>
+            </w:pPr>
+            <w:r>
+              <w:rPr>
+                <w:color w:val="1C2430"/>
+                <w:sz w:val="18"/>
+                <w:szCs w:val="18"/>
+              </w:rPr>
+              <w:t xml:space="preserve">A browser. Open dj_acs_auditor.html</w:t>
+            </w:r>
+          </w:p>
+        </w:tc>
+        <w:tc>
+          <w:tcPr>
+            <w:tcW w:type="dxa" w:w="1800"/>
+            <w:tcMar>
+              <w:top w:type="dxa" w:w="60"/>
+              <w:left w:type="dxa" w:w="90"/>
+              <w:bottom w:type="dxa" w:w="60"/>
+              <w:right w:type="dxa" w:w="90"/>
+            </w:tcMar>
+          </w:tcPr>
+          <w:p>
+            <w:pPr>
+              <w:spacing w:after="0"/>
+            </w:pPr>
+            <w:r>
+              <w:rPr>
+                <w:color w:val="1C2430"/>
+                <w:sz w:val="18"/>
+                <w:szCs w:val="18"/>
+              </w:rPr>
+              <w:t xml:space="preserve">No</w:t>
+            </w:r>
+          </w:p>
+        </w:tc>
+      </w:tr>
+      <w:tr>
+        <w:tc>
+          <w:tcPr>
+            <w:tcW w:type="dxa" w:w="4100"/>
+            <w:tcMar>
+              <w:top w:type="dxa" w:w="60"/>
+              <w:left w:type="dxa" w:w="90"/>
+              <w:bottom w:type="dxa" w:w="60"/>
+              <w:right w:type="dxa" w:w="90"/>
+            </w:tcMar>
+          </w:tcPr>
+          <w:p>
+            <w:pPr>
+              <w:spacing w:after="0"/>
+            </w:pPr>
+            <w:r>
+              <w:rPr>
+                <w:color w:val="1C2430"/>
+                <w:sz w:val="18"/>
+                <w:szCs w:val="18"/>
+              </w:rPr>
+              <w:t xml:space="preserve">Apply fixes with preview, confirmation and undo</w:t>
+            </w:r>
+          </w:p>
+        </w:tc>
+        <w:tc>
+          <w:tcPr>
+            <w:tcW w:type="dxa" w:w="3400"/>
+            <w:tcMar>
+              <w:top w:type="dxa" w:w="60"/>
+              <w:left w:type="dxa" w:w="90"/>
+              <w:bottom w:type="dxa" w:w="60"/>
+              <w:right w:type="dxa" w:w="90"/>
+            </w:tcMar>
+          </w:tcPr>
+          <w:p>
+            <w:pPr>
+              <w:spacing w:after="0"/>
+            </w:pPr>
+            <w:r>
+              <w:rPr>
+                <w:color w:val="1C2430"/>
+                <w:sz w:val="18"/>
+                <w:szCs w:val="18"/>
+              </w:rPr>
+              <w:t xml:space="preserve">The same file, Remediate tab</w:t>
+            </w:r>
+          </w:p>
+        </w:tc>
+        <w:tc>
+          <w:tcPr>
+            <w:tcW w:type="dxa" w:w="1800"/>
+            <w:tcMar>
+              <w:top w:type="dxa" w:w="60"/>
+              <w:left w:type="dxa" w:w="90"/>
+              <w:bottom w:type="dxa" w:w="60"/>
+              <w:right w:type="dxa" w:w="90"/>
+            </w:tcMar>
+          </w:tcPr>
+          <w:p>
+            <w:pPr>
+              <w:spacing w:after="0"/>
+            </w:pPr>
+            <w:r>
+              <w:rPr>
+                <w:color w:val="1C2430"/>
+                <w:sz w:val="18"/>
+                <w:szCs w:val="18"/>
+              </w:rPr>
+              <w:t xml:space="preserve">No</w:t>
+            </w:r>
+          </w:p>
+        </w:tc>
+      </w:tr>
+      <w:tr>
+        <w:tc>
+          <w:tcPr>
+            <w:tcW w:type="dxa" w:w="4100"/>
+            <w:tcMar>
+              <w:top w:type="dxa" w:w="60"/>
+              <w:left w:type="dxa" w:w="90"/>
+              <w:bottom w:type="dxa" w:w="60"/>
+              <w:right w:type="dxa" w:w="90"/>
+            </w:tcMar>
+          </w:tcPr>
+          <w:p>
+            <w:pPr>
+              <w:spacing w:after="0"/>
+            </w:pPr>
+            <w:r>
+              <w:rPr>
+                <w:color w:val="1C2430"/>
+                <w:sz w:val="18"/>
+                <w:szCs w:val="18"/>
+              </w:rPr>
+              <w:t xml:space="preserve">Pull data out of ACS</w:t>
+            </w:r>
+          </w:p>
+        </w:tc>
+        <w:tc>
+          <w:tcPr>
+            <w:tcW w:type="dxa" w:w="3400"/>
+            <w:tcMar>
+              <w:top w:type="dxa" w:w="60"/>
+              <w:left w:type="dxa" w:w="90"/>
+              <w:bottom w:type="dxa" w:w="60"/>
+              <w:right w:type="dxa" w:w="90"/>
+            </w:tcMar>
+          </w:tcPr>
+          <w:p>
+            <w:pPr>
+              <w:spacing w:after="0"/>
+            </w:pPr>
+            <w:r>
+              <w:rPr>
+                <w:color w:val="1C2430"/>
+                <w:sz w:val="18"/>
+                <w:szCs w:val="18"/>
+              </w:rPr>
+              <w:t xml:space="preserve">bash, curl, jq</w:t>
+            </w:r>
+          </w:p>
+        </w:tc>
+        <w:tc>
+          <w:tcPr>
+            <w:tcW w:type="dxa" w:w="1800"/>
+            <w:tcMar>
+              <w:top w:type="dxa" w:w="60"/>
+              <w:left w:type="dxa" w:w="90"/>
+              <w:bottom w:type="dxa" w:w="60"/>
+              <w:right w:type="dxa" w:w="90"/>
+            </w:tcMar>
+          </w:tcPr>
+          <w:p>
+            <w:pPr>
+              <w:spacing w:after="0"/>
+            </w:pPr>
+            <w:r>
+              <w:rPr>
+                <w:color w:val="1C2430"/>
+                <w:sz w:val="18"/>
+                <w:szCs w:val="18"/>
+              </w:rPr>
+              <w:t xml:space="preserve">No</w:t>
+            </w:r>
+          </w:p>
+        </w:tc>
+      </w:tr>
+      <w:tr>
+        <w:tc>
+          <w:tcPr>
+            <w:tcW w:type="dxa" w:w="4100"/>
+            <w:tcMar>
+              <w:top w:type="dxa" w:w="60"/>
+              <w:left w:type="dxa" w:w="90"/>
+              <w:bottom w:type="dxa" w:w="60"/>
+              <w:right w:type="dxa" w:w="90"/>
+            </w:tcMar>
+          </w:tcPr>
+          <w:p>
+            <w:pPr>
+              <w:spacing w:after="0"/>
+            </w:pPr>
+            <w:r>
+              <w:rPr>
+                <w:color w:val="1C2430"/>
+                <w:sz w:val="18"/>
+                <w:szCs w:val="18"/>
+              </w:rPr>
+              <w:t xml:space="preserve">Pull from Windows, or over SSH to a jump host</w:t>
+            </w:r>
+          </w:p>
+        </w:tc>
+        <w:tc>
+          <w:tcPr>
+            <w:tcW w:type="dxa" w:w="3400"/>
+            <w:tcMar>
+              <w:top w:type="dxa" w:w="60"/>
+              <w:left w:type="dxa" w:w="90"/>
+              <w:bottom w:type="dxa" w:w="60"/>
+              <w:right w:type="dxa" w:w="90"/>
+            </w:tcMar>
+          </w:tcPr>
+          <w:p>
+            <w:pPr>
+              <w:spacing w:after="0"/>
+            </w:pPr>
+            <w:r>
+              <w:rPr>
+                <w:color w:val="1C2430"/>
+                <w:sz w:val="18"/>
+                <w:szCs w:val="18"/>
+              </w:rPr>
+              <w:t xml:space="preserve">PowerShell 5.1 or newer, no modules</w:t>
+            </w:r>
+          </w:p>
+        </w:tc>
+        <w:tc>
+          <w:tcPr>
+            <w:tcW w:type="dxa" w:w="1800"/>
+            <w:tcMar>
+              <w:top w:type="dxa" w:w="60"/>
+              <w:left w:type="dxa" w:w="90"/>
+              <w:bottom w:type="dxa" w:w="60"/>
+              <w:right w:type="dxa" w:w="90"/>
+            </w:tcMar>
+          </w:tcPr>
+          <w:p>
+            <w:pPr>
+              <w:spacing w:after="0"/>
+            </w:pPr>
+            <w:r>
+              <w:rPr>
+                <w:color w:val="1C2430"/>
+                <w:sz w:val="18"/>
+                <w:szCs w:val="18"/>
+              </w:rPr>
+              <w:t xml:space="preserve">No</w:t>
+            </w:r>
+          </w:p>
+        </w:tc>
+      </w:tr>
+      <w:tr>
+        <w:tc>
+          <w:tcPr>
+            <w:tcW w:type="dxa" w:w="4100"/>
+            <w:tcMar>
+              <w:top w:type="dxa" w:w="60"/>
+              <w:left w:type="dxa" w:w="90"/>
+              <w:bottom w:type="dxa" w:w="60"/>
+              <w:right w:type="dxa" w:w="90"/>
+            </w:tcMar>
+          </w:tcPr>
+          <w:p>
+            <w:pPr>
+              <w:spacing w:after="0"/>
+            </w:pPr>
+            <w:r>
+              <w:rPr>
+                <w:color w:val="1C2430"/>
+                <w:sz w:val="18"/>
+                <w:szCs w:val="18"/>
+              </w:rPr>
+              <w:t xml:space="preserve">Summarise a pull from the shell</w:t>
+            </w:r>
+          </w:p>
+        </w:tc>
+        <w:tc>
+          <w:tcPr>
+            <w:tcW w:type="dxa" w:w="3400"/>
+            <w:tcMar>
+              <w:top w:type="dxa" w:w="60"/>
+              <w:left w:type="dxa" w:w="90"/>
+              <w:bottom w:type="dxa" w:w="60"/>
+              <w:right w:type="dxa" w:w="90"/>
+            </w:tcMar>
+          </w:tcPr>
+          <w:p>
+            <w:pPr>
+              <w:spacing w:after="0"/>
+            </w:pPr>
+            <w:r>
+              <w:rPr>
+                <w:color w:val="1C2430"/>
+                <w:sz w:val="18"/>
+                <w:szCs w:val="18"/>
+              </w:rPr>
+              <w:t xml:space="preserve">jq</w:t>
+            </w:r>
+          </w:p>
+        </w:tc>
+        <w:tc>
+          <w:tcPr>
+            <w:tcW w:type="dxa" w:w="1800"/>
+            <w:tcMar>
+              <w:top w:type="dxa" w:w="60"/>
+              <w:left w:type="dxa" w:w="90"/>
+              <w:bottom w:type="dxa" w:w="60"/>
+              <w:right w:type="dxa" w:w="90"/>
+            </w:tcMar>
+          </w:tcPr>
+          <w:p>
+            <w:pPr>
+              <w:spacing w:after="0"/>
+            </w:pPr>
+            <w:r>
+              <w:rPr>
+                <w:color w:val="1C2430"/>
+                <w:sz w:val="18"/>
+                <w:szCs w:val="18"/>
+              </w:rPr>
+              <w:t xml:space="preserve">No</w:t>
+            </w:r>
+          </w:p>
+        </w:tc>
+      </w:tr>
+      <w:tr>
+        <w:tc>
+          <w:tcPr>
+            <w:tcW w:type="dxa" w:w="4100"/>
+            <w:tcMar>
+              <w:top w:type="dxa" w:w="60"/>
+              <w:left w:type="dxa" w:w="90"/>
+              <w:bottom w:type="dxa" w:w="60"/>
+              <w:right w:type="dxa" w:w="90"/>
+            </w:tcMar>
+          </w:tcPr>
+          <w:p>
+            <w:pPr>
+              <w:spacing w:after="0"/>
+            </w:pPr>
+            <w:r>
+              <w:rPr>
+                <w:color w:val="1C2430"/>
+                <w:sz w:val="18"/>
+                <w:szCs w:val="18"/>
+              </w:rPr>
+              <w:t xml:space="preserve">Run the audit headless, in a pipeline</w:t>
+            </w:r>
+          </w:p>
+        </w:tc>
+        <w:tc>
+          <w:tcPr>
+            <w:tcW w:type="dxa" w:w="3400"/>
+            <w:tcMar>
+              <w:top w:type="dxa" w:w="60"/>
+              <w:left w:type="dxa" w:w="90"/>
+              <w:bottom w:type="dxa" w:w="60"/>
+              <w:right w:type="dxa" w:w="90"/>
+            </w:tcMar>
+          </w:tcPr>
+          <w:p>
+            <w:pPr>
+              <w:spacing w:after="0"/>
+            </w:pPr>
+            <w:r>
+              <w:rPr>
+                <w:color w:val="1C2430"/>
+                <w:sz w:val="18"/>
+                <w:szCs w:val="18"/>
+              </w:rPr>
+              <w:t xml:space="preserve">acs_cli.js</w:t>
+            </w:r>
+          </w:p>
+        </w:tc>
+        <w:tc>
+          <w:tcPr>
+            <w:tcW w:type="dxa" w:w="1800"/>
+            <w:tcMar>
+              <w:top w:type="dxa" w:w="60"/>
+              <w:left w:type="dxa" w:w="90"/>
+              <w:bottom w:type="dxa" w:w="60"/>
+              <w:right w:type="dxa" w:w="90"/>
+            </w:tcMar>
+          </w:tcPr>
+          <w:p>
+            <w:pPr>
+              <w:spacing w:after="0"/>
+            </w:pPr>
+            <w:r>
+              <w:rPr>
+                <w:color w:val="1C2430"/>
+                <w:sz w:val="18"/>
+                <w:szCs w:val="18"/>
+              </w:rPr>
+              <w:t xml:space="preserve">Yes, Node 18 or newer</w:t>
+            </w:r>
+          </w:p>
+        </w:tc>
+      </w:tr>
+      <w:tr>
+        <w:tc>
+          <w:tcPr>
+            <w:tcW w:type="dxa" w:w="4100"/>
+            <w:tcMar>
+              <w:top w:type="dxa" w:w="60"/>
+              <w:left w:type="dxa" w:w="90"/>
+              <w:bottom w:type="dxa" w:w="60"/>
+              <w:right w:type="dxa" w:w="90"/>
+            </w:tcMar>
+          </w:tcPr>
+          <w:p>
+            <w:pPr>
+              <w:spacing w:after="0"/>
+            </w:pPr>
+            <w:r>
+              <w:rPr>
+                <w:color w:val="1C2430"/>
+                <w:sz w:val="18"/>
+                <w:szCs w:val="18"/>
+              </w:rPr>
+              <w:t xml:space="preserve">Run the test suite</w:t>
+            </w:r>
+          </w:p>
+        </w:tc>
+        <w:tc>
+          <w:tcPr>
+            <w:tcW w:type="dxa" w:w="3400"/>
+            <w:tcMar>
+              <w:top w:type="dxa" w:w="60"/>
+              <w:left w:type="dxa" w:w="90"/>
+              <w:bottom w:type="dxa" w:w="60"/>
+              <w:right w:type="dxa" w:w="90"/>
+            </w:tcMar>
+          </w:tcPr>
+          <w:p>
+            <w:pPr>
+              <w:spacing w:after="0"/>
+            </w:pPr>
+            <w:r>
+              <w:rPr>
+                <w:color w:val="1C2430"/>
+                <w:sz w:val="18"/>
+                <w:szCs w:val="18"/>
+              </w:rPr>
+              <w:t xml:space="preserve">test/run_tests.js</w:t>
+            </w:r>
+          </w:p>
+        </w:tc>
+        <w:tc>
+          <w:tcPr>
+            <w:tcW w:type="dxa" w:w="1800"/>
+            <w:tcMar>
+              <w:top w:type="dxa" w:w="60"/>
+              <w:left w:type="dxa" w:w="90"/>
+              <w:bottom w:type="dxa" w:w="60"/>
+              <w:right w:type="dxa" w:w="90"/>
+            </w:tcMar>
+          </w:tcPr>
+          <w:p>
+            <w:pPr>
+              <w:spacing w:after="0"/>
+            </w:pPr>
+            <w:r>
+              <w:rPr>
+                <w:color w:val="1C2430"/>
+                <w:sz w:val="18"/>
+                <w:szCs w:val="18"/>
+              </w:rPr>
+              <w:t xml:space="preserve">Yes</w:t>
+            </w:r>
+          </w:p>
+        </w:tc>
+      </w:tr>
+    </w:tbl>
+    <w:p>
+      <w:pPr>
+        <w:spacing w:after="140"/>
+      </w:pPr>
+      <w:r>
+        <w:rPr>
+          <w:sz w:val="21"/>
+          <w:szCs w:val="21"/>
+        </w:rPr>
+        <w:t xml:space="preserve"/>
       </w:r>
     </w:p>
     <w:p>
@@ -2069,7 +3003,87 @@
           <w:sz w:val="20"/>
           <w:szCs w:val="20"/>
         </w:rPr>
-        <w:t xml:space="preserve">Want to see it work before trusting it with real manifests</w:t>
+        <w:t xml:space="preserve">If Node cannot be installed on the machine you audit from</w:t>
+      </w:r>
+    </w:p>
+    <w:p>
+      <w:pPr>
+        <w:pBdr>
+          <w:top w:val="single" w:color="EAF6EC" w:sz="2"/>
+          <w:bottom w:val="single" w:color="EAF6EC" w:sz="2"/>
+          <w:left w:val="single" w:color="1A7F37" w:sz="18"/>
+        </w:pBdr>
+        <w:shd w:fill="EAF6EC" w:val="clear"/>
+        <w:spacing w:after="40"/>
+        <w:ind w:left="160" w:right="160"/>
+      </w:pPr>
+      <w:r>
+        <w:rPr>
+          <w:color w:val="1C2430"/>
+          <w:sz w:val="20"/>
+          <w:szCs w:val="20"/>
+        </w:rPr>
+        <w:t xml:space="preserve">This is normal on a hardened host in a controlled enclave, and it is a supported path rather than a limitation you have to work around.</w:t>
+      </w:r>
+    </w:p>
+    <w:p>
+      <w:pPr>
+        <w:pBdr>
+          <w:top w:val="single" w:color="EAF6EC" w:sz="2"/>
+          <w:bottom w:val="single" w:color="EAF6EC" w:sz="2"/>
+          <w:left w:val="single" w:color="1A7F37" w:sz="18"/>
+        </w:pBdr>
+        <w:shd w:fill="EAF6EC" w:val="clear"/>
+        <w:spacing w:after="40"/>
+        <w:ind w:left="160" w:right="160"/>
+      </w:pPr>
+      <w:r>
+        <w:rPr>
+          <w:color w:val="1C2430"/>
+          <w:sz w:val="20"/>
+          <w:szCs w:val="20"/>
+        </w:rPr>
+        <w:t xml:space="preserve">Everything in the audit itself is available: the page computes the posture, lists the violations, routes the fixes and drafts the YAML, and it needs a browser and nothing else. The pull scripts are bash and curl.</w:t>
+      </w:r>
+    </w:p>
+    <w:p>
+      <w:pPr>
+        <w:pBdr>
+          <w:top w:val="single" w:color="EAF6EC" w:sz="2"/>
+          <w:bottom w:val="single" w:color="EAF6EC" w:sz="2"/>
+          <w:left w:val="single" w:color="1A7F37" w:sz="18"/>
+        </w:pBdr>
+        <w:shd w:fill="EAF6EC" w:val="clear"/>
+        <w:spacing w:after="40"/>
+        <w:ind w:left="160" w:right="160"/>
+      </w:pPr>
+      <w:r>
+        <w:rPr>
+          <w:color w:val="1C2430"/>
+          <w:sz w:val="20"/>
+          <w:szCs w:val="20"/>
+        </w:rPr>
+        <w:t xml:space="preserve">For something you can read or hand over without leaving the shell, scripts/acs_summary.sh turns a pull directory into a markdown summary using jq. It counts what ACS reported. It does not compute a posture score and does not draft fixes, because both need the policy engine, and it says so in its own output rather than printing a number it has not earned.</w:t>
+      </w:r>
+    </w:p>
+    <w:p>
+      <w:pPr>
+        <w:pBdr>
+          <w:top w:val="single" w:color="EAF6EC" w:sz="2"/>
+          <w:bottom w:val="single" w:color="EAF6EC" w:sz="2"/>
+          <w:left w:val="single" w:color="1A7F37" w:sz="18"/>
+        </w:pBdr>
+        <w:shd w:fill="EAF6EC" w:val="clear"/>
+        <w:spacing w:after="40"/>
+        <w:ind w:left="160" w:right="160"/>
+      </w:pPr>
+      <w:r>
+        <w:rPr>
+          <w:color w:val="1C2430"/>
+          <w:sz w:val="20"/>
+          <w:szCs w:val="20"/>
+        </w:rPr>
+        <w:t xml:space="preserve">If the host has podman or docker, the command line runner works without installing anything: podman run --rm -v "$PWD":/w:Z -w /w docker.io/library/node:20-alpine node acs_cli.js --help</w:t>
       </w:r>
     </w:p>
     <w:p>
@@ -2089,7 +3103,121 @@
           <w:sz w:val="20"/>
           <w:szCs w:val="20"/>
         </w:rPr>
-        <w:t xml:space="preserve">Both pages have a Load a deliberately bad sample button. It loads a small manifest set that trips a spread of policies across every severity, so you can walk the full workflow, apply fixes, and undo them without touching anything of yours.</w:t>
+        <w:t xml:space="preserve">The wrappers acs.sh, acs.ps1 and acs.cmd detect a missing Node and print these routes rather than failing with command not found.</w:t>
+      </w:r>
+    </w:p>
+    <w:p>
+      <w:pPr>
+        <w:pStyle w:val="Heading2"/>
+        <w:spacing w:after="100" w:before="240"/>
+      </w:pPr>
+      <w:r>
+        <w:rPr>
+          <w:sz w:val="21"/>
+          <w:szCs w:val="21"/>
+        </w:rPr>
+        <w:t xml:space="preserve">Requirements</w:t>
+      </w:r>
+    </w:p>
+    <w:p>
+      <w:pPr>
+        <w:pStyle w:val="ListParagraph"/>
+        <w:numPr>
+          <w:ilvl w:val="0"/>
+          <w:numId w:val="2"/>
+        </w:numPr>
+        <w:spacing w:after="70"/>
+      </w:pPr>
+      <w:r>
+        <w:rPr>
+          <w:sz w:val="21"/>
+          <w:szCs w:val="21"/>
+        </w:rPr>
+        <w:t xml:space="preserve">A current browser. Chrome, Edge, Firefox, or Safari. The page uses the File System Access API for folder upload where available and falls back to a directory input where it is not.</w:t>
+      </w:r>
+    </w:p>
+    <w:p>
+      <w:pPr>
+        <w:pStyle w:val="ListParagraph"/>
+        <w:numPr>
+          <w:ilvl w:val="0"/>
+          <w:numId w:val="2"/>
+        </w:numPr>
+        <w:spacing w:after="70"/>
+      </w:pPr>
+      <w:r>
+        <w:rPr>
+          <w:sz w:val="21"/>
+          <w:szCs w:val="21"/>
+        </w:rPr>
+        <w:t xml:space="preserve">The YAML you want audited, either as loose files or a whole folder tree.</w:t>
+      </w:r>
+    </w:p>
+    <w:p>
+      <w:pPr>
+        <w:pStyle w:val="ListParagraph"/>
+        <w:numPr>
+          <w:ilvl w:val="0"/>
+          <w:numId w:val="2"/>
+        </w:numPr>
+        <w:spacing w:after="70"/>
+      </w:pPr>
+      <w:r>
+        <w:rPr>
+          <w:sz w:val="21"/>
+          <w:szCs w:val="21"/>
+        </w:rPr>
+        <w:t xml:space="preserve">Optional but recommended: the output of scripts/acs_pull_all.sh, which is what turns a manifest audit into a cross check against what your cluster is actually running.</w:t>
+      </w:r>
+    </w:p>
+    <w:p>
+      <w:pPr>
+        <w:pStyle w:val="Heading2"/>
+        <w:spacing w:after="100" w:before="240"/>
+      </w:pPr>
+      <w:r>
+        <w:rPr>
+          <w:sz w:val="21"/>
+          <w:szCs w:val="21"/>
+        </w:rPr>
+        <w:t xml:space="preserve">What the tool never asks for</w:t>
+      </w:r>
+    </w:p>
+    <w:p>
+      <w:pPr>
+        <w:spacing w:after="120"/>
+      </w:pPr>
+      <w:r>
+        <w:rPr>
+          <w:sz w:val="21"/>
+          <w:szCs w:val="21"/>
+        </w:rPr>
+        <w:t xml:space="preserve">It does not ask for cluster write access, a kubeconfig, a service account, an admission webhook, or anything installed on a node. If a workflow ever seems to want one of those, you are not in this tool.</w:t>
+      </w:r>
+    </w:p>
+    <w:p>
+      <w:pPr>
+        <w:pStyle w:val="Heading2"/>
+        <w:spacing w:after="100" w:before="240"/>
+      </w:pPr>
+      <w:r>
+        <w:rPr>
+          <w:sz w:val="21"/>
+          <w:szCs w:val="21"/>
+        </w:rPr>
+        <w:t xml:space="preserve">Working disconnected</w:t>
+      </w:r>
+    </w:p>
+    <w:p>
+      <w:pPr>
+        <w:spacing w:after="120"/>
+      </w:pPr>
+      <w:r>
+        <w:rPr>
+          <w:sz w:val="21"/>
+          <w:szCs w:val="21"/>
+        </w:rPr>
+        <w:t xml:space="preserve">Everything the page needs is committed alongside it. js-yaml and JSZip are vendored, so a machine with no route to the internet, no npm, and no proxy runs the tool identically to one that is fully connected. This matters on classified and air gapped networks, where the usual answer of "just npm install it" is not available, and it is the same reason the tool refuses to fetch a parser at runtime: a security tool quietly pulling code off the internet is itself a reportable event.</w:t>
       </w:r>
     </w:p>
     <w:p>
@@ -2102,7 +3230,164 @@
           <w:sz w:val="21"/>
           <w:szCs w:val="21"/>
         </w:rPr>
-        <w:t xml:space="preserve">5. Loading manifests and reading the audit</w:t>
+        <w:t xml:space="preserve">5. Quick start</w:t>
+      </w:r>
+    </w:p>
+    <w:p>
+      <w:pPr>
+        <w:pStyle w:val="ListParagraph"/>
+        <w:numPr>
+          <w:ilvl w:val="0"/>
+          <w:numId w:val="3"/>
+        </w:numPr>
+        <w:spacing w:after="70"/>
+      </w:pPr>
+      <w:r>
+        <w:rPr>
+          <w:sz w:val="21"/>
+          <w:szCs w:val="21"/>
+        </w:rPr>
+        <w:t xml:space="preserve">Open dj_acs_auditor.html. There is one file and it has two tabs.</w:t>
+      </w:r>
+    </w:p>
+    <w:p>
+      <w:pPr>
+        <w:pStyle w:val="ListParagraph"/>
+        <w:numPr>
+          <w:ilvl w:val="0"/>
+          <w:numId w:val="3"/>
+        </w:numPr>
+        <w:spacing w:after="70"/>
+      </w:pPr>
+      <w:r>
+        <w:rPr>
+          <w:sz w:val="21"/>
+          <w:szCs w:val="21"/>
+        </w:rPr>
+        <w:t xml:space="preserve">Drag your manifest folder onto the drop zone, or press Browse folder. Drop the output of scripts/acs_pull_all.sh on it at the same time if you have it.</w:t>
+      </w:r>
+    </w:p>
+    <w:p>
+      <w:pPr>
+        <w:pStyle w:val="ListParagraph"/>
+        <w:numPr>
+          <w:ilvl w:val="0"/>
+          <w:numId w:val="3"/>
+        </w:numPr>
+        <w:spacing w:after="70"/>
+      </w:pPr>
+      <w:r>
+        <w:rPr>
+          <w:sz w:val="21"/>
+          <w:szCs w:val="21"/>
+        </w:rPr>
+        <w:t xml:space="preserve">Stay on the Audit tab. Read the posture cards: the weighted compliance score now, and what it becomes once the safe fixes are applied.</w:t>
+      </w:r>
+    </w:p>
+    <w:p>
+      <w:pPr>
+        <w:pStyle w:val="ListParagraph"/>
+        <w:numPr>
+          <w:ilvl w:val="0"/>
+          <w:numId w:val="3"/>
+        </w:numPr>
+        <w:spacing w:after="70"/>
+      </w:pPr>
+      <w:r>
+        <w:rPr>
+          <w:sz w:val="21"/>
+          <w:szCs w:val="21"/>
+        </w:rPr>
+        <w:t xml:space="preserve">Sort the findings table by Score to see what hurts most, and read the Violations from ACS panel for what your cluster is actually reporting.</w:t>
+      </w:r>
+    </w:p>
+    <w:p>
+      <w:pPr>
+        <w:pStyle w:val="ListParagraph"/>
+        <w:numPr>
+          <w:ilvl w:val="0"/>
+          <w:numId w:val="3"/>
+        </w:numPr>
+        <w:spacing w:after="70"/>
+      </w:pPr>
+      <w:r>
+        <w:rPr>
+          <w:sz w:val="21"/>
+          <w:szCs w:val="21"/>
+        </w:rPr>
+        <w:t xml:space="preserve">Press Download the audit report to keep the evidence.</w:t>
+      </w:r>
+    </w:p>
+    <w:p>
+      <w:pPr>
+        <w:pStyle w:val="ListParagraph"/>
+        <w:numPr>
+          <w:ilvl w:val="0"/>
+          <w:numId w:val="3"/>
+        </w:numPr>
+        <w:spacing w:after="70"/>
+      </w:pPr>
+      <w:r>
+        <w:rPr>
+          <w:sz w:val="21"/>
+          <w:szCs w:val="21"/>
+        </w:rPr>
+        <w:t xml:space="preserve">Switch to the Remediate tab to change anything. Nothing there will touch a file until you move the Mode selector off Report only.</w:t>
+      </w:r>
+    </w:p>
+    <w:p>
+      <w:pPr>
+        <w:pBdr>
+          <w:top w:val="single" w:color="EAF6EC" w:sz="2"/>
+          <w:bottom w:val="single" w:color="EAF6EC" w:sz="2"/>
+          <w:left w:val="single" w:color="1A7F37" w:sz="18"/>
+        </w:pBdr>
+        <w:shd w:fill="EAF6EC" w:val="clear"/>
+        <w:spacing w:after="0" w:before="120"/>
+        <w:ind w:left="160" w:right="160"/>
+      </w:pPr>
+      <w:r>
+        <w:rPr>
+          <w:b/>
+          <w:bCs/>
+          <w:color w:val="1C2430"/>
+          <w:sz w:val="20"/>
+          <w:szCs w:val="20"/>
+        </w:rPr>
+        <w:t xml:space="preserve">Want to see it work before trusting it with real manifests</w:t>
+      </w:r>
+    </w:p>
+    <w:p>
+      <w:pPr>
+        <w:pBdr>
+          <w:top w:val="single" w:color="EAF6EC" w:sz="2"/>
+          <w:bottom w:val="single" w:color="EAF6EC" w:sz="2"/>
+          <w:left w:val="single" w:color="1A7F37" w:sz="18"/>
+        </w:pBdr>
+        <w:shd w:fill="EAF6EC" w:val="clear"/>
+        <w:spacing w:after="160"/>
+        <w:ind w:left="160" w:right="160"/>
+      </w:pPr>
+      <w:r>
+        <w:rPr>
+          <w:color w:val="1C2430"/>
+          <w:sz w:val="20"/>
+          <w:szCs w:val="20"/>
+        </w:rPr>
+        <w:t xml:space="preserve">There is a Load a deliberately bad sample button on the drop zone. It loads a small manifest set that trips a spread of policies across every severity, so you can walk the full workflow, apply fixes, and undo them without touching anything of yours.</w:t>
+      </w:r>
+    </w:p>
+    <w:p>
+      <w:pPr>
+        <w:pStyle w:val="Heading1"/>
+        <w:spacing w:after="140" w:before="320"/>
+      </w:pPr>
+      <w:r>
+        <w:rPr>
+          <w:sz w:val="21"/>
+          <w:szCs w:val="21"/>
+        </w:rPr>
+        <w:t xml:space="preserve">6. Loading manifests and reading the audit</w:t>
       </w:r>
     </w:p>
     <w:p>
@@ -2201,7 +3486,7 @@
           <w:sz w:val="21"/>
           <w:szCs w:val="21"/>
         </w:rPr>
-        <w:t xml:space="preserve">The left card is your weighted compliance score as the manifests stand today. The right card is the projected score once every automatic fix is applied. The difference between them is the honest value of running the remediation page, and section 13 explains exactly how both numbers are computed.</w:t>
+        <w:t xml:space="preserve">The left card is your weighted compliance score as the manifests stand today. The right card is the projected score once every automatic fix is applied. The difference between them is the honest value of working the Remediate tab, and section 14 explains exactly how both numbers are computed, including why you get no score at all when no manifests were scanned.</w:t>
       </w:r>
     </w:p>
     <w:p>
@@ -2366,7 +3651,7 @@
           <w:sz w:val="21"/>
           <w:szCs w:val="21"/>
         </w:rPr>
-        <w:t xml:space="preserve">6. Getting the data out of ACS</w:t>
+        <w:t xml:space="preserve">7. Getting the data out of ACS</w:t>
       </w:r>
     </w:p>
     <w:p>
@@ -3325,7 +4610,262 @@
           <w:sz w:val="21"/>
           <w:szCs w:val="21"/>
         </w:rPr>
+        <w:t xml:space="preserve">Where the files land</w:t>
+      </w:r>
+    </w:p>
+    <w:p>
+      <w:pPr>
+        <w:spacing w:after="120"/>
+      </w:pPr>
+      <w:r>
+        <w:rPr>
+          <w:sz w:val="21"/>
+          <w:szCs w:val="21"/>
+        </w:rPr>
+        <w:t xml:space="preserve">Each run gets its own directory, named for the moment it ran:</w:t>
+      </w:r>
+    </w:p>
+    <w:p>
+      <w:pPr>
+        <w:shd w:fill="F4F6F8" w:val="clear"/>
+        <w:spacing w:after="0" w:before="40"/>
+        <w:ind w:left="240" w:right="240"/>
+      </w:pPr>
+      <w:r>
+        <w:rPr>
+          <w:rFonts w:ascii="Consolas" w:cs="Consolas" w:eastAsia="Consolas" w:hAnsi="Consolas"/>
+          <w:color w:val="24292F"/>
+          <w:sz w:val="17"/>
+          <w:szCs w:val="17"/>
+        </w:rPr>
+        <w:t xml:space="preserve">./scripts/acs_pull_all.sh -o findings</w:t>
+      </w:r>
+    </w:p>
+    <w:p>
+      <w:pPr>
+        <w:shd w:fill="F4F6F8" w:val="clear"/>
+        <w:spacing w:after="0" w:before="0"/>
+        <w:ind w:left="240" w:right="240"/>
+      </w:pPr>
+      <w:r>
+        <w:rPr>
+          <w:rFonts w:ascii="Consolas" w:cs="Consolas" w:eastAsia="Consolas" w:hAnsi="Consolas"/>
+          <w:color w:val="24292F"/>
+          <w:sz w:val="17"/>
+          <w:szCs w:val="17"/>
+        </w:rPr>
+        <w:t xml:space="preserve"> </w:t>
+      </w:r>
+    </w:p>
+    <w:p>
+      <w:pPr>
+        <w:shd w:fill="F4F6F8" w:val="clear"/>
+        <w:spacing w:after="0" w:before="0"/>
+        <w:ind w:left="240" w:right="240"/>
+      </w:pPr>
+      <w:r>
+        <w:rPr>
+          <w:rFonts w:ascii="Consolas" w:cs="Consolas" w:eastAsia="Consolas" w:hAnsi="Consolas"/>
+          <w:color w:val="24292F"/>
+          <w:sz w:val="17"/>
+          <w:szCs w:val="17"/>
+        </w:rPr>
+        <w:t xml:space="preserve">findings/</w:t>
+      </w:r>
+    </w:p>
+    <w:p>
+      <w:pPr>
+        <w:shd w:fill="F4F6F8" w:val="clear"/>
+        <w:spacing w:after="0" w:before="0"/>
+        <w:ind w:left="240" w:right="240"/>
+      </w:pPr>
+      <w:r>
+        <w:rPr>
+          <w:rFonts w:ascii="Consolas" w:cs="Consolas" w:eastAsia="Consolas" w:hAnsi="Consolas"/>
+          <w:color w:val="24292F"/>
+          <w:sz w:val="17"/>
+          <w:szCs w:val="17"/>
+        </w:rPr>
+        <w:t xml:space="preserve">  acs_findings_20260821_143022/</w:t>
+      </w:r>
+    </w:p>
+    <w:p>
+      <w:pPr>
+        <w:shd w:fill="F4F6F8" w:val="clear"/>
+        <w:spacing w:after="0" w:before="0"/>
+        <w:ind w:left="240" w:right="240"/>
+      </w:pPr>
+      <w:r>
+        <w:rPr>
+          <w:rFonts w:ascii="Consolas" w:cs="Consolas" w:eastAsia="Consolas" w:hAnsi="Consolas"/>
+          <w:color w:val="24292F"/>
+          <w:sz w:val="17"/>
+          <w:szCs w:val="17"/>
+        </w:rPr>
+        <w:t xml:space="preserve">    00_auth_status.json</w:t>
+      </w:r>
+    </w:p>
+    <w:p>
+      <w:pPr>
+        <w:shd w:fill="F4F6F8" w:val="clear"/>
+        <w:spacing w:after="0" w:before="0"/>
+        <w:ind w:left="240" w:right="240"/>
+      </w:pPr>
+      <w:r>
+        <w:rPr>
+          <w:rFonts w:ascii="Consolas" w:cs="Consolas" w:eastAsia="Consolas" w:hAnsi="Consolas"/>
+          <w:color w:val="24292F"/>
+          <w:sz w:val="17"/>
+          <w:szCs w:val="17"/>
+        </w:rPr>
+        <w:t xml:space="preserve">    01_alerts_list.json</w:t>
+      </w:r>
+    </w:p>
+    <w:p>
+      <w:pPr>
+        <w:shd w:fill="F4F6F8" w:val="clear"/>
+        <w:spacing w:after="0" w:before="0"/>
+        <w:ind w:left="240" w:right="240"/>
+      </w:pPr>
+      <w:r>
+        <w:rPr>
+          <w:rFonts w:ascii="Consolas" w:cs="Consolas" w:eastAsia="Consolas" w:hAnsi="Consolas"/>
+          <w:color w:val="24292F"/>
+          <w:sz w:val="17"/>
+          <w:szCs w:val="17"/>
+        </w:rPr>
+        <w:t xml:space="preserve">    ...</w:t>
+      </w:r>
+    </w:p>
+    <w:p>
+      <w:pPr>
+        <w:shd w:fill="F4F6F8" w:val="clear"/>
+        <w:spacing w:after="0" w:before="0"/>
+        <w:ind w:left="240" w:right="240"/>
+      </w:pPr>
+      <w:r>
+        <w:rPr>
+          <w:rFonts w:ascii="Consolas" w:cs="Consolas" w:eastAsia="Consolas" w:hAnsi="Consolas"/>
+          <w:color w:val="24292F"/>
+          <w:sz w:val="17"/>
+          <w:szCs w:val="17"/>
+        </w:rPr>
+        <w:t xml:space="preserve">  acs_findings_20260822_091500/</w:t>
+      </w:r>
+    </w:p>
+    <w:p>
+      <w:pPr>
+        <w:shd w:fill="F4F6F8" w:val="clear"/>
+        <w:spacing w:after="140" w:before="0"/>
+        <w:ind w:left="240" w:right="240"/>
+      </w:pPr>
+      <w:r>
+        <w:rPr>
+          <w:rFonts w:ascii="Consolas" w:cs="Consolas" w:eastAsia="Consolas" w:hAnsi="Consolas"/>
+          <w:color w:val="24292F"/>
+          <w:sz w:val="17"/>
+          <w:szCs w:val="17"/>
+        </w:rPr>
+        <w:t xml:space="preserve">    ...</w:t>
+      </w:r>
+    </w:p>
+    <w:p>
+      <w:pPr>
+        <w:spacing w:after="120"/>
+      </w:pPr>
+      <w:r>
+        <w:rPr>
+          <w:sz w:val="21"/>
+          <w:szCs w:val="21"/>
+        </w:rPr>
+        <w:t xml:space="preserve">The -o flag names the parent, not the run. A second run never overwrites the first, which matters more than it sounds: an export you cannot compare against last week is worth much less than one you can, and proving a fix landed means holding both.</w:t>
+      </w:r>
+    </w:p>
+    <w:p>
+      <w:pPr>
+        <w:spacing w:after="120"/>
+      </w:pPr>
+      <w:r>
+        <w:rPr>
+          <w:sz w:val="21"/>
+          <w:szCs w:val="21"/>
+        </w:rPr>
+        <w:t xml:space="preserve">Pass --no-timestamp when you want the files written straight into -o, which is usually a pipeline that expects a fixed path.</w:t>
+      </w:r>
+    </w:p>
+    <w:p>
+      <w:pPr>
+        <w:pStyle w:val="Heading2"/>
+        <w:spacing w:after="100" w:before="240"/>
+      </w:pPr>
+      <w:r>
+        <w:rPr>
+          <w:sz w:val="21"/>
+          <w:szCs w:val="21"/>
+        </w:rPr>
         <w:t xml:space="preserve">Step three: drop them on the page</w:t>
+      </w:r>
+    </w:p>
+    <w:p>
+      <w:pPr>
+        <w:pBdr>
+          <w:top w:val="single" w:color="EEF3FA" w:sz="2"/>
+          <w:bottom w:val="single" w:color="EEF3FA" w:sz="2"/>
+          <w:left w:val="single" w:color="1F6FEB" w:sz="18"/>
+        </w:pBdr>
+        <w:shd w:fill="EEF3FA" w:val="clear"/>
+        <w:spacing w:after="0" w:before="120"/>
+        <w:ind w:left="160" w:right="160"/>
+      </w:pPr>
+      <w:r>
+        <w:rPr>
+          <w:b/>
+          <w:bCs/>
+          <w:color w:val="1C2430"/>
+          <w:sz w:val="20"/>
+          <w:szCs w:val="20"/>
+        </w:rPr>
+        <w:t xml:space="preserve">If you use Browse files rather than dragging</w:t>
+      </w:r>
+    </w:p>
+    <w:p>
+      <w:pPr>
+        <w:pBdr>
+          <w:top w:val="single" w:color="EEF3FA" w:sz="2"/>
+          <w:bottom w:val="single" w:color="EEF3FA" w:sz="2"/>
+          <w:left w:val="single" w:color="1F6FEB" w:sz="18"/>
+        </w:pBdr>
+        <w:shd w:fill="EEF3FA" w:val="clear"/>
+        <w:spacing w:after="40"/>
+        <w:ind w:left="160" w:right="160"/>
+      </w:pPr>
+      <w:r>
+        <w:rPr>
+          <w:color w:val="1C2430"/>
+          <w:sz w:val="20"/>
+          <w:szCs w:val="20"/>
+        </w:rPr>
+        <w:t xml:space="preserve">The picker now offers .ndjson and .jsonl as well as .yaml and .json. It previously filtered to .yaml, .yml and .json only, which made three of the seven files the pull script writes invisible in the dialog while drag and drop accepted them perfectly well.</w:t>
+      </w:r>
+    </w:p>
+    <w:p>
+      <w:pPr>
+        <w:pBdr>
+          <w:top w:val="single" w:color="EEF3FA" w:sz="2"/>
+          <w:bottom w:val="single" w:color="EEF3FA" w:sz="2"/>
+          <w:left w:val="single" w:color="1F6FEB" w:sz="18"/>
+        </w:pBdr>
+        <w:shd w:fill="EEF3FA" w:val="clear"/>
+        <w:spacing w:after="160"/>
+        <w:ind w:left="160" w:right="160"/>
+      </w:pPr>
+      <w:r>
+        <w:rPr>
+          <w:color w:val="1C2430"/>
+          <w:sz w:val="20"/>
+          <w:szCs w:val="20"/>
+        </w:rPr>
+        <w:t xml:space="preserve">If you are on an older copy and cannot see 03_vuln_workloads.ndjson in the file picker, that is why. Drag it instead, or update.</w:t>
       </w:r>
     </w:p>
     <w:p>
@@ -3495,7 +5035,7 @@
           <w:sz w:val="21"/>
           <w:szCs w:val="21"/>
         </w:rPr>
-        <w:t xml:space="preserve">7. Vulnerabilities: why an empty alert list proves nothing</w:t>
+        <w:t xml:space="preserve">8. Vulnerabilities: why an empty alert list proves nothing</w:t>
       </w:r>
     </w:p>
     <w:p>
@@ -3910,7 +5450,7 @@
           <w:sz w:val="21"/>
           <w:szCs w:val="21"/>
         </w:rPr>
-        <w:t xml:space="preserve">8. Working the CVE list</w:t>
+        <w:t xml:space="preserve">9. Working the CVE list</w:t>
       </w:r>
     </w:p>
     <w:p>
@@ -5096,7 +6636,7 @@
           <w:sz w:val="20"/>
           <w:szCs w:val="20"/>
         </w:rPr>
-        <w:t xml:space="preserve">What the tool does instead: ranks the work, names the file, and emits a rebuild worklist grouped by image, because you rebuild an image once and every fixable CVE inside it clears together. Then, on the remediation page, you can apply a replacement image reference that you supply, with the same preview, confirmation and undo as every other fix.</w:t>
+        <w:t xml:space="preserve">What the tool does instead: ranks the work, names the file, and emits a rebuild worklist grouped by image, because you rebuild an image once and every fixable CVE inside it clears together. Then, on the Remediate tab, you can apply a replacement image reference that you supply, with the same preview, confirmation and undo as every other fix.</w:t>
       </w:r>
     </w:p>
     <w:p>
@@ -5146,7 +6686,7 @@
           <w:sz w:val="21"/>
           <w:szCs w:val="21"/>
         </w:rPr>
-        <w:t xml:space="preserve">9. Seeing and fixing violations</w:t>
+        <w:t xml:space="preserve">10. Seeing and fixing violations</w:t>
       </w:r>
     </w:p>
     <w:p>
@@ -5508,7 +7048,7 @@
                 <w:sz w:val="18"/>
                 <w:szCs w:val="18"/>
               </w:rPr>
-              <w:t xml:space="preserve">Use the remediation page. You get a diff, a confirmation, and undo.</w:t>
+              <w:t xml:space="preserve">Use the Remediate tab. You get a diff, a confirmation, and undo.</w:t>
             </w:r>
           </w:p>
         </w:tc>
@@ -6965,7 +8505,7 @@
           <w:sz w:val="21"/>
           <w:szCs w:val="21"/>
         </w:rPr>
-        <w:t xml:space="preserve">10. Applying fixes</w:t>
+        <w:t xml:space="preserve">11. Applying fixes</w:t>
       </w:r>
     </w:p>
     <w:p>
@@ -6977,7 +8517,7 @@
           <w:sz w:val="21"/>
           <w:szCs w:val="21"/>
         </w:rPr>
-        <w:t xml:space="preserve">Open dj_acs_remediation.html. It loads manifests the same way the auditor does, and it offers three ways to work through the fixes. All three show a real diff computed against your actual file, not a description of what might happen.</w:t>
+        <w:t xml:space="preserve">Switch to the Remediate tab. It works on the same files you already loaded, with the same findings the Audit tab scored, and it offers three ways to work through the fixes. All three show a real diff computed against your actual file, not a description of what might happen.</w:t>
       </w:r>
     </w:p>
     <w:p>
@@ -7199,7 +8739,7 @@
           <w:sz w:val="21"/>
           <w:szCs w:val="21"/>
         </w:rPr>
-        <w:t xml:space="preserve">11. What gets fixed automatically, and what deliberately does not</w:t>
+        <w:t xml:space="preserve">12. What gets fixed automatically, and what deliberately does not</w:t>
       </w:r>
     </w:p>
     <w:p>
@@ -7441,7 +8981,179 @@
           <w:sz w:val="21"/>
           <w:szCs w:val="21"/>
         </w:rPr>
-        <w:t xml:space="preserve">12. Taking the result out</w:t>
+        <w:t xml:space="preserve">13. Taking the result out</w:t>
+      </w:r>
+    </w:p>
+    <w:p>
+      <w:pPr>
+        <w:pStyle w:val="Heading2"/>
+        <w:spacing w:after="100" w:before="240"/>
+      </w:pPr>
+      <w:r>
+        <w:rPr>
+          <w:sz w:val="21"/>
+          <w:szCs w:val="21"/>
+        </w:rPr>
+        <w:t xml:space="preserve">What is in the audit report</w:t>
+      </w:r>
+    </w:p>
+    <w:p>
+      <w:pPr>
+        <w:spacing w:after="120"/>
+      </w:pPr>
+      <w:r>
+        <w:rPr>
+          <w:sz w:val="21"/>
+          <w:szCs w:val="21"/>
+        </w:rPr>
+        <w:t xml:space="preserve">The HTML report is the artifact that outlives the session and gets attached to a ticket or an accreditation package, so everything visible in the page reaches it:</w:t>
+      </w:r>
+    </w:p>
+    <w:p>
+      <w:pPr>
+        <w:pStyle w:val="ListParagraph"/>
+        <w:numPr>
+          <w:ilvl w:val="0"/>
+          <w:numId w:val="2"/>
+        </w:numPr>
+        <w:spacing w:after="70"/>
+      </w:pPr>
+      <w:r>
+        <w:rPr>
+          <w:sz w:val="21"/>
+          <w:szCs w:val="21"/>
+        </w:rPr>
+        <w:t xml:space="preserve">The posture summary and the per category breakdown, when manifests were scanned. When none were, it says so and explains why rather than printing a score. See section 14.</w:t>
+      </w:r>
+    </w:p>
+    <w:p>
+      <w:pPr>
+        <w:pStyle w:val="ListParagraph"/>
+        <w:numPr>
+          <w:ilvl w:val="0"/>
+          <w:numId w:val="2"/>
+        </w:numPr>
+        <w:spacing w:after="70"/>
+      </w:pPr>
+      <w:r>
+        <w:rPr>
+          <w:sz w:val="21"/>
+          <w:szCs w:val="21"/>
+        </w:rPr>
+        <w:t xml:space="preserve">Every finding in your manifests, with the policy, the object, the file, the severity and the fix classification.</w:t>
+      </w:r>
+    </w:p>
+    <w:p>
+      <w:pPr>
+        <w:pStyle w:val="ListParagraph"/>
+        <w:numPr>
+          <w:ilvl w:val="0"/>
+          <w:numId w:val="2"/>
+        </w:numPr>
+        <w:spacing w:after="70"/>
+      </w:pPr>
+      <w:r>
+        <w:rPr>
+          <w:sz w:val="21"/>
+          <w:szCs w:val="21"/>
+        </w:rPr>
+        <w:t xml:space="preserve">Every violation ACS reported, split into your workloads and platform components, each with its fix route. The platform section states whether that split came from the ACS platformComponent field or from a namespace match, because those are different claims.</w:t>
+      </w:r>
+    </w:p>
+    <w:p>
+      <w:pPr>
+        <w:pStyle w:val="ListParagraph"/>
+        <w:numPr>
+          <w:ilvl w:val="0"/>
+          <w:numId w:val="2"/>
+        </w:numPr>
+        <w:spacing w:after="70"/>
+      </w:pPr>
+      <w:r>
+        <w:rPr>
+          <w:sz w:val="21"/>
+          <w:szCs w:val="21"/>
+        </w:rPr>
+        <w:t xml:space="preserve">Image CVEs, when a vulnerability export was supplied, ranked and kept visually separate from the configuration posture so nobody adds the two together.</w:t>
+      </w:r>
+    </w:p>
+    <w:p>
+      <w:pPr>
+        <w:pStyle w:val="ListParagraph"/>
+        <w:numPr>
+          <w:ilvl w:val="0"/>
+          <w:numId w:val="2"/>
+        </w:numPr>
+        <w:spacing w:after="70"/>
+      </w:pPr>
+      <w:r>
+        <w:rPr>
+          <w:sz w:val="21"/>
+          <w:szCs w:val="21"/>
+        </w:rPr>
+        <w:t xml:space="preserve">The method, the limits, and the references, so a reviewer can see what the numbers mean without asking you.</w:t>
+      </w:r>
+    </w:p>
+    <w:p>
+      <w:pPr>
+        <w:pBdr>
+          <w:top w:val="single" w:color="FFF8E1" w:sz="2"/>
+          <w:bottom w:val="single" w:color="FFF8E1" w:sz="2"/>
+          <w:left w:val="single" w:color="D4A72C" w:sz="18"/>
+        </w:pBdr>
+        <w:shd w:fill="FFF8E1" w:val="clear"/>
+        <w:spacing w:after="0" w:before="120"/>
+        <w:ind w:left="160" w:right="160"/>
+      </w:pPr>
+      <w:r>
+        <w:rPr>
+          <w:b/>
+          <w:bCs/>
+          <w:color w:val="1C2430"/>
+          <w:sz w:val="20"/>
+          <w:szCs w:val="20"/>
+        </w:rPr>
+        <w:t xml:space="preserve">If you have a report from an earlier version that looks empty</w:t>
+      </w:r>
+    </w:p>
+    <w:p>
+      <w:pPr>
+        <w:pBdr>
+          <w:top w:val="single" w:color="FFF8E1" w:sz="2"/>
+          <w:bottom w:val="single" w:color="FFF8E1" w:sz="2"/>
+          <w:left w:val="single" w:color="D4A72C" w:sz="18"/>
+        </w:pBdr>
+        <w:shd w:fill="FFF8E1" w:val="clear"/>
+        <w:spacing w:after="40"/>
+        <w:ind w:left="160" w:right="160"/>
+      </w:pPr>
+      <w:r>
+        <w:rPr>
+          <w:color w:val="1C2430"/>
+          <w:sz w:val="20"/>
+          <w:szCs w:val="20"/>
+        </w:rPr>
+        <w:t xml:space="preserve">Before 1.2.0 the report rendered only findings from scanned manifests. A run with an ACS export and no YAML produced about five kilobytes of headings and method notes while the page it came from was listing dozens of violations.</w:t>
+      </w:r>
+    </w:p>
+    <w:p>
+      <w:pPr>
+        <w:pBdr>
+          <w:top w:val="single" w:color="FFF8E1" w:sz="2"/>
+          <w:bottom w:val="single" w:color="FFF8E1" w:sz="2"/>
+          <w:left w:val="single" w:color="D4A72C" w:sz="18"/>
+        </w:pBdr>
+        <w:shd w:fill="FFF8E1" w:val="clear"/>
+        <w:spacing w:after="160"/>
+        <w:ind w:left="160" w:right="160"/>
+      </w:pPr>
+      <w:r>
+        <w:rPr>
+          <w:color w:val="1C2430"/>
+          <w:sz w:val="20"/>
+          <w:szCs w:val="20"/>
+        </w:rPr>
+        <w:t xml:space="preserve">Regenerate it. The data was never lost, it just was not written into the document.</w:t>
       </w:r>
     </w:p>
     <w:p>
@@ -7891,7 +9603,7 @@
           <w:sz w:val="21"/>
           <w:szCs w:val="21"/>
         </w:rPr>
-        <w:t xml:space="preserve">13. How the score is calculated</w:t>
+        <w:t xml:space="preserve">14. How the score is calculated</w:t>
       </w:r>
     </w:p>
     <w:p>
@@ -7953,7 +9665,7 @@
           <w:sz w:val="20"/>
           <w:szCs w:val="20"/>
         </w:rPr>
-        <w:t xml:space="preserve">It also means scoring zero manifests returns 100 out of 100, Grade A. That is arithmetically correct and completely misleading: nothing was scanned, so nothing was found. If you load an ACS export and no YAML, the pages and the CLI refuse to show a number and say why.</w:t>
+        <w:t xml:space="preserve">It also means scoring zero manifests returns 100 out of 100, Grade A. That is arithmetically correct and completely misleading: nothing was scanned, so nothing was found. If you load an ACS export and no YAML, the page, the CLI and the report all refuse to show a number and say why.</w:t>
       </w:r>
     </w:p>
     <w:p>
@@ -8694,7 +10406,7 @@
           <w:sz w:val="21"/>
           <w:szCs w:val="21"/>
         </w:rPr>
-        <w:t xml:space="preserve">14. Policy reference</w:t>
+        <w:t xml:space="preserve">15. Policy reference</w:t>
       </w:r>
     </w:p>
     <w:p>
@@ -11330,7 +13042,7 @@
           <w:sz w:val="21"/>
           <w:szCs w:val="21"/>
         </w:rPr>
-        <w:t xml:space="preserve">Every finding also carries citations to the CIS Kubernetes Benchmark, NIST SP 800-53 Rev 5, the Kubernetes Pod Security Standards, and DISA STIG. Press View the policy catalogue on the auditor page to read the full entry for any policy, including the rationale and the remediation text.</w:t>
+        <w:t xml:space="preserve">Every finding also carries citations to the CIS Kubernetes Benchmark, NIST SP 800-53 Rev 5, the Kubernetes Pod Security Standards, and DISA STIG. Press View the policy catalogue on the Audit tab to read the full entry for any policy, including the rationale and the remediation text.</w:t>
       </w:r>
     </w:p>
     <w:p>
@@ -11343,7 +13055,7 @@
           <w:sz w:val="21"/>
           <w:szCs w:val="21"/>
         </w:rPr>
-        <w:t xml:space="preserve">15. Limits, stated plainly</w:t>
+        <w:t xml:space="preserve">16. Limits, stated plainly</w:t>
       </w:r>
     </w:p>
     <w:p>
@@ -11360,7 +13072,7 @@
           <w:sz w:val="21"/>
           <w:szCs w:val="21"/>
         </w:rPr>
-        <w:t xml:space="preserve">This is static analysis of manifest text. The pages never contact a cluster at all. The scripts do, and they only ever issue a GET.</w:t>
+        <w:t xml:space="preserve">This is static analysis of manifest text. The page never contacts a cluster at all. The scripts do, and they only ever issue a GET.</w:t>
       </w:r>
     </w:p>
     <w:p>
@@ -11475,7 +13187,7 @@
           <w:sz w:val="21"/>
           <w:szCs w:val="21"/>
         </w:rPr>
-        <w:t xml:space="preserve">16. Troubleshooting</w:t>
+        <w:t xml:space="preserve">17. Troubleshooting</w:t>
       </w:r>
     </w:p>
     <w:tbl>
@@ -11648,7 +13360,7 @@
                 <w:sz w:val="18"/>
                 <w:szCs w:val="18"/>
               </w:rPr>
-              <w:t xml:space="preserve">Removed, deliberately. It could never work from a file:// page and the token risk was real while the benefit was zero. Use scripts/acs_pull_all.sh. See section 6.</w:t>
+              <w:t xml:space="preserve">Removed, deliberately. It could never work from a file:// page and the token risk was real while the benefit was zero. Use scripts/acs_pull_all.sh. See section 7.</w:t>
             </w:r>
           </w:p>
         </w:tc>
@@ -11848,7 +13560,7 @@
                 <w:sz w:val="18"/>
                 <w:szCs w:val="18"/>
               </w:rPr>
-              <w:t xml:space="preserve">You are on an older copy. Violations are rows with a fix route on each one. See section 9.</w:t>
+              <w:t xml:space="preserve">You are on an older copy. Violations are rows with a fix route on each one. See section 10.</w:t>
             </w:r>
           </w:p>
         </w:tc>
@@ -11898,7 +13610,7 @@
                 <w:sz w:val="18"/>
                 <w:szCs w:val="18"/>
               </w:rPr>
-              <w:t xml:space="preserve">Fixed. That was a score over zero manifests: an empty denominator reads as perfect. Both pages now refuse the number and say so. If you still see it, you are on an older copy.</w:t>
+              <w:t xml:space="preserve">Fixed. That was a score over zero manifests: an empty denominator reads as perfect. The page and the CLI now refuse the number and say so. If you still see it, you are on an older copy.</w:t>
             </w:r>
           </w:p>
         </w:tc>
@@ -11948,7 +13660,7 @@
                 <w:sz w:val="18"/>
                 <w:szCs w:val="18"/>
               </w:rPr>
-              <w:t xml:space="preserve">Check whether the row says ACS said so or guessed from namespace. If it is a guess and you own the object, press override. See section 9.</w:t>
+              <w:t xml:space="preserve">Check whether the row says ACS said so or guessed from namespace. If it is a guess and you own the object, press override. See section 10.</w:t>
             </w:r>
           </w:p>
         </w:tc>
@@ -12048,7 +13760,7 @@
                 <w:sz w:val="18"/>
                 <w:szCs w:val="18"/>
               </w:rPr>
-              <w:t xml:space="preserve">You fetched the list without the detail. GET /v1/alerts returns ListAlert, which has no violations array. Tick Fetch violation detail. See section 6.</w:t>
+              <w:t xml:space="preserve">You fetched the list without the detail. GET /v1/alerts returns ListAlert, which has no violations array. Tick Fetch violation detail. See section 7.</w:t>
             </w:r>
           </w:p>
         </w:tc>
@@ -12414,7 +14126,7 @@
           <w:sz w:val="21"/>
           <w:szCs w:val="21"/>
         </w:rPr>
-        <w:t xml:space="preserve">17. Contact</w:t>
+        <w:t xml:space="preserve">18. Contact</w:t>
       </w:r>
     </w:p>
     <w:p>

</xml_diff>